<commit_message>
Report: drop company profile section; fix underscore formatting
Co-Authored-By: Claude Opus 5.5 <noreply@anthropic.com>
Claude-Session: https://claude.ai/code/session_01SefLkeJGfqSPbmYLA9m1RC
</commit_message>
<xml_diff>
--- a/docs/internship-report/SHOPSPHERE_TEAM_INTERNSHIP_REPORT.docx
+++ b/docs/internship-report/SHOPSPHERE_TEAM_INTERNSHIP_REPORT.docx
@@ -446,7 +446,7 @@
           <w:sz w:val="21"/>
           <w:szCs w:val="21"/>
         </w:rPr>
-        <w:t xml:space="preserve">1. INTRODUCTION AND COMPANY PROFILE	1</w:t>
+        <w:t xml:space="preserve">1. INTRODUCTION	1</w:t>
       </w:r>
     </w:p>
     <w:p>
@@ -482,7 +482,7 @@
           <w:sz w:val="21"/>
           <w:szCs w:val="21"/>
         </w:rPr>
-        <w:t xml:space="preserve">1.2  Company Profile	1</w:t>
+        <w:t xml:space="preserve">1.2  Objectives of the Internship	1</w:t>
       </w:r>
     </w:p>
     <w:p>
@@ -500,7 +500,25 @@
           <w:sz w:val="21"/>
           <w:szCs w:val="21"/>
         </w:rPr>
-        <w:t xml:space="preserve">1.3  Objectives of the Internship	1</w:t>
+        <w:t xml:space="preserve">1.3  Scope and Organisation of the Report	1</w:t>
+      </w:r>
+    </w:p>
+    <w:p>
+      <w:pPr>
+        <w:tabs>
+          <w:tab w:val="right" w:pos="8660" w:leader="dot"/>
+        </w:tabs>
+        <w:spacing w:after="20" w:before="50" w:line="250"/>
+        <w:ind w:left="0"/>
+      </w:pPr>
+      <w:r>
+        <w:rPr>
+          <w:b/>
+          <w:bCs/>
+          <w:sz w:val="21"/>
+          <w:szCs w:val="21"/>
+        </w:rPr>
+        <w:t xml:space="preserve">2. PROJECT OVERVIEW AND REQUIREMENTS	2</w:t>
       </w:r>
     </w:p>
     <w:p>
@@ -518,7 +536,79 @@
           <w:sz w:val="21"/>
           <w:szCs w:val="21"/>
         </w:rPr>
-        <w:t xml:space="preserve">1.4  Scope and Organisation of the Report	1</w:t>
+        <w:t xml:space="preserve">2.1  Problem Statement	2</w:t>
+      </w:r>
+    </w:p>
+    <w:p>
+      <w:pPr>
+        <w:tabs>
+          <w:tab w:val="right" w:pos="8660" w:leader="dot"/>
+        </w:tabs>
+        <w:spacing w:after="0" w:before="0" w:line="250"/>
+        <w:ind w:left="440"/>
+      </w:pPr>
+      <w:r>
+        <w:rPr>
+          <w:b w:val="false"/>
+          <w:bCs w:val="false"/>
+          <w:sz w:val="21"/>
+          <w:szCs w:val="21"/>
+        </w:rPr>
+        <w:t xml:space="preserve">2.2  Limitations Addressed and Proposed Solution	2</w:t>
+      </w:r>
+    </w:p>
+    <w:p>
+      <w:pPr>
+        <w:tabs>
+          <w:tab w:val="right" w:pos="8660" w:leader="dot"/>
+        </w:tabs>
+        <w:spacing w:after="0" w:before="0" w:line="250"/>
+        <w:ind w:left="440"/>
+      </w:pPr>
+      <w:r>
+        <w:rPr>
+          <w:b w:val="false"/>
+          <w:bCs w:val="false"/>
+          <w:sz w:val="21"/>
+          <w:szCs w:val="21"/>
+        </w:rPr>
+        <w:t xml:space="preserve">2.3  Joint Project Teams	2</w:t>
+      </w:r>
+    </w:p>
+    <w:p>
+      <w:pPr>
+        <w:tabs>
+          <w:tab w:val="right" w:pos="8660" w:leader="dot"/>
+        </w:tabs>
+        <w:spacing w:after="0" w:before="0" w:line="250"/>
+        <w:ind w:left="440"/>
+      </w:pPr>
+      <w:r>
+        <w:rPr>
+          <w:b w:val="false"/>
+          <w:bCs w:val="false"/>
+          <w:sz w:val="21"/>
+          <w:szCs w:val="21"/>
+        </w:rPr>
+        <w:t xml:space="preserve">2.4  Software Requirements and Development Environment	2</w:t>
+      </w:r>
+    </w:p>
+    <w:p>
+      <w:pPr>
+        <w:tabs>
+          <w:tab w:val="right" w:pos="8660" w:leader="dot"/>
+        </w:tabs>
+        <w:spacing w:after="0" w:before="0" w:line="250"/>
+        <w:ind w:left="440"/>
+      </w:pPr>
+      <w:r>
+        <w:rPr>
+          <w:b w:val="false"/>
+          <w:bCs w:val="false"/>
+          <w:sz w:val="21"/>
+          <w:szCs w:val="21"/>
+        </w:rPr>
+        <w:t xml:space="preserve">2.5  Technology Stack	3</w:t>
       </w:r>
     </w:p>
     <w:p>
@@ -536,7 +626,7 @@
           <w:sz w:val="21"/>
           <w:szCs w:val="21"/>
         </w:rPr>
-        <w:t xml:space="preserve">2. PROJECT OVERVIEW AND REQUIREMENTS	3</w:t>
+        <w:t xml:space="preserve">3. SYSTEM DESIGN	4</w:t>
       </w:r>
     </w:p>
     <w:p>
@@ -554,7 +644,7 @@
           <w:sz w:val="21"/>
           <w:szCs w:val="21"/>
         </w:rPr>
-        <w:t xml:space="preserve">2.1  Problem Statement	3</w:t>
+        <w:t xml:space="preserve">3.1  Overall Architecture	4</w:t>
       </w:r>
     </w:p>
     <w:p>
@@ -572,7 +662,7 @@
           <w:sz w:val="21"/>
           <w:szCs w:val="21"/>
         </w:rPr>
-        <w:t xml:space="preserve">2.2  Limitations Addressed and Proposed Solution	3</w:t>
+        <w:t xml:space="preserve">3.2  Frontend-to-Backend Request Flow	4</w:t>
       </w:r>
     </w:p>
     <w:p>
@@ -590,7 +680,25 @@
           <w:sz w:val="21"/>
           <w:szCs w:val="21"/>
         </w:rPr>
-        <w:t xml:space="preserve">2.3  Joint Project Teams	3</w:t>
+        <w:t xml:space="preserve">3.3  Database Design and Data Models	5</w:t>
+      </w:r>
+    </w:p>
+    <w:p>
+      <w:pPr>
+        <w:tabs>
+          <w:tab w:val="right" w:pos="8660" w:leader="dot"/>
+        </w:tabs>
+        <w:spacing w:after="20" w:before="50" w:line="250"/>
+        <w:ind w:left="0"/>
+      </w:pPr>
+      <w:r>
+        <w:rPr>
+          <w:b/>
+          <w:bCs/>
+          <w:sz w:val="21"/>
+          <w:szCs w:val="21"/>
+        </w:rPr>
+        <w:t xml:space="preserve">4. FUNCTIONAL MODULES AND WORKFLOWS	6</w:t>
       </w:r>
     </w:p>
     <w:p>
@@ -608,7 +716,7 @@
           <w:sz w:val="21"/>
           <w:szCs w:val="21"/>
         </w:rPr>
-        <w:t xml:space="preserve">2.4  Software Requirements and Development Environment	3</w:t>
+        <w:t xml:space="preserve">4.1  Customer Storefront	6</w:t>
       </w:r>
     </w:p>
     <w:p>
@@ -626,7 +734,79 @@
           <w:sz w:val="21"/>
           <w:szCs w:val="21"/>
         </w:rPr>
-        <w:t xml:space="preserve">2.5  Technology Stack	4</w:t>
+        <w:t xml:space="preserve">4.2  Seller Portal	7</w:t>
+      </w:r>
+    </w:p>
+    <w:p>
+      <w:pPr>
+        <w:tabs>
+          <w:tab w:val="right" w:pos="8660" w:leader="dot"/>
+        </w:tabs>
+        <w:spacing w:after="0" w:before="0" w:line="250"/>
+        <w:ind w:left="440"/>
+      </w:pPr>
+      <w:r>
+        <w:rPr>
+          <w:b w:val="false"/>
+          <w:bCs w:val="false"/>
+          <w:sz w:val="21"/>
+          <w:szCs w:val="21"/>
+        </w:rPr>
+        <w:t xml:space="preserve">4.3  Administrator Console	7</w:t>
+      </w:r>
+    </w:p>
+    <w:p>
+      <w:pPr>
+        <w:tabs>
+          <w:tab w:val="right" w:pos="8660" w:leader="dot"/>
+        </w:tabs>
+        <w:spacing w:after="0" w:before="0" w:line="250"/>
+        <w:ind w:left="440"/>
+      </w:pPr>
+      <w:r>
+        <w:rPr>
+          <w:b w:val="false"/>
+          <w:bCs w:val="false"/>
+          <w:sz w:val="21"/>
+          <w:szCs w:val="21"/>
+        </w:rPr>
+        <w:t xml:space="preserve">4.4  Delivery Partner Console	7</w:t>
+      </w:r>
+    </w:p>
+    <w:p>
+      <w:pPr>
+        <w:tabs>
+          <w:tab w:val="right" w:pos="8660" w:leader="dot"/>
+        </w:tabs>
+        <w:spacing w:after="0" w:before="0" w:line="250"/>
+        <w:ind w:left="440"/>
+      </w:pPr>
+      <w:r>
+        <w:rPr>
+          <w:b w:val="false"/>
+          <w:bCs w:val="false"/>
+          <w:sz w:val="21"/>
+          <w:szCs w:val="21"/>
+        </w:rPr>
+        <w:t xml:space="preserve">4.5  Core Workflows	8</w:t>
+      </w:r>
+    </w:p>
+    <w:p>
+      <w:pPr>
+        <w:tabs>
+          <w:tab w:val="right" w:pos="8660" w:leader="dot"/>
+        </w:tabs>
+        <w:spacing w:after="0" w:before="0" w:line="250"/>
+        <w:ind w:left="440"/>
+      </w:pPr>
+      <w:r>
+        <w:rPr>
+          <w:b w:val="false"/>
+          <w:bCs w:val="false"/>
+          <w:sz w:val="21"/>
+          <w:szCs w:val="21"/>
+        </w:rPr>
+        <w:t xml:space="preserve">4.6  Payments, Notifications and Supporting Modules	9</w:t>
       </w:r>
     </w:p>
     <w:p>
@@ -644,7 +824,7 @@
           <w:sz w:val="21"/>
           <w:szCs w:val="21"/>
         </w:rPr>
-        <w:t xml:space="preserve">3. SYSTEM DESIGN	5</w:t>
+        <w:t xml:space="preserve">5. AUTHENTICATION AND AUTHORIZATION IMPLEMENTATION	10</w:t>
       </w:r>
     </w:p>
     <w:p>
@@ -662,7 +842,7 @@
           <w:sz w:val="21"/>
           <w:szCs w:val="21"/>
         </w:rPr>
-        <w:t xml:space="preserve">3.1  Overall Architecture	5</w:t>
+        <w:t xml:space="preserve">5.1  Shared Login and Role Selection	10</w:t>
       </w:r>
     </w:p>
     <w:p>
@@ -680,7 +860,7 @@
           <w:sz w:val="21"/>
           <w:szCs w:val="21"/>
         </w:rPr>
-        <w:t xml:space="preserve">3.2  Frontend-to-Backend Request Flow	6</w:t>
+        <w:t xml:space="preserve">5.2  Login Processing on the Server	10</w:t>
       </w:r>
     </w:p>
     <w:p>
@@ -698,7 +878,43 @@
           <w:sz w:val="21"/>
           <w:szCs w:val="21"/>
         </w:rPr>
-        <w:t xml:space="preserve">3.3  Database Design and Data Models	6</w:t>
+        <w:t xml:space="preserve">5.3  Cross-Portal Session Hand-off	11</w:t>
+      </w:r>
+    </w:p>
+    <w:p>
+      <w:pPr>
+        <w:tabs>
+          <w:tab w:val="right" w:pos="8660" w:leader="dot"/>
+        </w:tabs>
+        <w:spacing w:after="0" w:before="0" w:line="250"/>
+        <w:ind w:left="440"/>
+      </w:pPr>
+      <w:r>
+        <w:rPr>
+          <w:b w:val="false"/>
+          <w:bCs w:val="false"/>
+          <w:sz w:val="21"/>
+          <w:szCs w:val="21"/>
+        </w:rPr>
+        <w:t xml:space="preserve">5.4  Authorization Middleware	12</w:t>
+      </w:r>
+    </w:p>
+    <w:p>
+      <w:pPr>
+        <w:tabs>
+          <w:tab w:val="right" w:pos="8660" w:leader="dot"/>
+        </w:tabs>
+        <w:spacing w:after="0" w:before="0" w:line="250"/>
+        <w:ind w:left="440"/>
+      </w:pPr>
+      <w:r>
+        <w:rPr>
+          <w:b w:val="false"/>
+          <w:bCs w:val="false"/>
+          <w:sz w:val="21"/>
+          <w:szCs w:val="21"/>
+        </w:rPr>
+        <w:t xml:space="preserve">5.5  Password, Reset and Registration Controls	13</w:t>
       </w:r>
     </w:p>
     <w:p>
@@ -716,7 +932,7 @@
           <w:sz w:val="21"/>
           <w:szCs w:val="21"/>
         </w:rPr>
-        <w:t xml:space="preserve">4. FUNCTIONAL MODULES AND WORKFLOWS	7</w:t>
+        <w:t xml:space="preserve">6. TESTING AND VERIFICATION	14</w:t>
       </w:r>
     </w:p>
     <w:p>
@@ -734,7 +950,7 @@
           <w:sz w:val="21"/>
           <w:szCs w:val="21"/>
         </w:rPr>
-        <w:t xml:space="preserve">4.1  Customer Storefront	7</w:t>
+        <w:t xml:space="preserve">6.1  Test Environment and Approach	14</w:t>
       </w:r>
     </w:p>
     <w:p>
@@ -752,7 +968,7 @@
           <w:sz w:val="21"/>
           <w:szCs w:val="21"/>
         </w:rPr>
-        <w:t xml:space="preserve">4.2  Seller Portal	8</w:t>
+        <w:t xml:space="preserve">6.2  Repository Test Suites	14</w:t>
       </w:r>
     </w:p>
     <w:p>
@@ -770,7 +986,25 @@
           <w:sz w:val="21"/>
           <w:szCs w:val="21"/>
         </w:rPr>
-        <w:t xml:space="preserve">4.3  Administrator Console	8</w:t>
+        <w:t xml:space="preserve">6.3  Authentication and Authorization Test Cases	14</w:t>
+      </w:r>
+    </w:p>
+    <w:p>
+      <w:pPr>
+        <w:tabs>
+          <w:tab w:val="right" w:pos="8660" w:leader="dot"/>
+        </w:tabs>
+        <w:spacing w:after="20" w:before="50" w:line="250"/>
+        <w:ind w:left="0"/>
+      </w:pPr>
+      <w:r>
+        <w:rPr>
+          <w:b/>
+          <w:bCs/>
+          <w:sz w:val="21"/>
+          <w:szCs w:val="21"/>
+        </w:rPr>
+        <w:t xml:space="preserve">7. TEAM CONTRIBUTIONS AND COLLABORATION	16</w:t>
       </w:r>
     </w:p>
     <w:p>
@@ -788,7 +1022,7 @@
           <w:sz w:val="21"/>
           <w:szCs w:val="21"/>
         </w:rPr>
-        <w:t xml:space="preserve">4.4  Delivery Partner Console	8</w:t>
+        <w:t xml:space="preserve">7.1  Team Structure	16</w:t>
       </w:r>
     </w:p>
     <w:p>
@@ -806,7 +1040,7 @@
           <w:sz w:val="21"/>
           <w:szCs w:val="21"/>
         </w:rPr>
-        <w:t xml:space="preserve">4.5  Core Workflows	9</w:t>
+        <w:t xml:space="preserve">7.2  Member Contributions	16</w:t>
       </w:r>
     </w:p>
     <w:p>
@@ -824,7 +1058,25 @@
           <w:sz w:val="21"/>
           <w:szCs w:val="21"/>
         </w:rPr>
-        <w:t xml:space="preserve">4.6  Payments, Notifications and Supporting Modules	10</w:t>
+        <w:t xml:space="preserve">7.3  Repository Evidence	17</w:t>
+      </w:r>
+    </w:p>
+    <w:p>
+      <w:pPr>
+        <w:tabs>
+          <w:tab w:val="right" w:pos="8660" w:leader="dot"/>
+        </w:tabs>
+        <w:spacing w:after="0" w:before="0" w:line="250"/>
+        <w:ind w:left="440"/>
+      </w:pPr>
+      <w:r>
+        <w:rPr>
+          <w:b w:val="false"/>
+          <w:bCs w:val="false"/>
+          <w:sz w:val="21"/>
+          <w:szCs w:val="21"/>
+        </w:rPr>
+        <w:t xml:space="preserve">7.4  Work Allocation Summary	17</w:t>
       </w:r>
     </w:p>
     <w:p>
@@ -842,7 +1094,7 @@
           <w:sz w:val="21"/>
           <w:szCs w:val="21"/>
         </w:rPr>
-        <w:t xml:space="preserve">5. AUTHENTICATION AND AUTHORIZATION IMPLEMENTATION	11</w:t>
+        <w:t xml:space="preserve">8. CHALLENGES, OUTCOMES AND LIMITATIONS	19</w:t>
       </w:r>
     </w:p>
     <w:p>
@@ -860,7 +1112,7 @@
           <w:sz w:val="21"/>
           <w:szCs w:val="21"/>
         </w:rPr>
-        <w:t xml:space="preserve">5.1  Shared Login and Role Selection	11</w:t>
+        <w:t xml:space="preserve">8.1  Challenges and Solutions	19</w:t>
       </w:r>
     </w:p>
     <w:p>
@@ -878,7 +1130,7 @@
           <w:sz w:val="21"/>
           <w:szCs w:val="21"/>
         </w:rPr>
-        <w:t xml:space="preserve">5.2  Login Processing on the Server	11</w:t>
+        <w:t xml:space="preserve">8.2  Project Outcomes	19</w:t>
       </w:r>
     </w:p>
     <w:p>
@@ -896,7 +1148,25 @@
           <w:sz w:val="21"/>
           <w:szCs w:val="21"/>
         </w:rPr>
-        <w:t xml:space="preserve">5.3  Cross-Portal Session Hand-off	12</w:t>
+        <w:t xml:space="preserve">8.3  Limitations Identified	19</w:t>
+      </w:r>
+    </w:p>
+    <w:p>
+      <w:pPr>
+        <w:tabs>
+          <w:tab w:val="right" w:pos="8660" w:leader="dot"/>
+        </w:tabs>
+        <w:spacing w:after="20" w:before="50" w:line="250"/>
+        <w:ind w:left="0"/>
+      </w:pPr>
+      <w:r>
+        <w:rPr>
+          <w:b/>
+          <w:bCs/>
+          <w:sz w:val="21"/>
+          <w:szCs w:val="21"/>
+        </w:rPr>
+        <w:t xml:space="preserve">9. LEARNING OUTCOMES, CONCLUSION AND FUTURE ENHANCEMENTS	21</w:t>
       </w:r>
     </w:p>
     <w:p>
@@ -914,7 +1184,7 @@
           <w:sz w:val="21"/>
           <w:szCs w:val="21"/>
         </w:rPr>
-        <w:t xml:space="preserve">5.4  Authorization Middleware	13</w:t>
+        <w:t xml:space="preserve">9.1  Learning Outcomes	21</w:t>
       </w:r>
     </w:p>
     <w:p>
@@ -932,7 +1202,25 @@
           <w:sz w:val="21"/>
           <w:szCs w:val="21"/>
         </w:rPr>
-        <w:t xml:space="preserve">5.5  Password, Reset and Registration Controls	14</w:t>
+        <w:t xml:space="preserve">9.2  Conclusion	21</w:t>
+      </w:r>
+    </w:p>
+    <w:p>
+      <w:pPr>
+        <w:tabs>
+          <w:tab w:val="right" w:pos="8660" w:leader="dot"/>
+        </w:tabs>
+        <w:spacing w:after="0" w:before="0" w:line="250"/>
+        <w:ind w:left="440"/>
+      </w:pPr>
+      <w:r>
+        <w:rPr>
+          <w:b w:val="false"/>
+          <w:bCs w:val="false"/>
+          <w:sz w:val="21"/>
+          <w:szCs w:val="21"/>
+        </w:rPr>
+        <w:t xml:space="preserve">9.3  Future Enhancements	21</w:t>
       </w:r>
     </w:p>
     <w:p>
@@ -950,313 +1238,7 @@
           <w:sz w:val="21"/>
           <w:szCs w:val="21"/>
         </w:rPr>
-        <w:t xml:space="preserve">6. TESTING AND VERIFICATION	15</w:t>
-      </w:r>
-    </w:p>
-    <w:p>
-      <w:pPr>
-        <w:tabs>
-          <w:tab w:val="right" w:pos="8660" w:leader="dot"/>
-        </w:tabs>
-        <w:spacing w:after="0" w:before="0" w:line="250"/>
-        <w:ind w:left="440"/>
-      </w:pPr>
-      <w:r>
-        <w:rPr>
-          <w:b w:val="false"/>
-          <w:bCs w:val="false"/>
-          <w:sz w:val="21"/>
-          <w:szCs w:val="21"/>
-        </w:rPr>
-        <w:t xml:space="preserve">6.1  Test Environment and Approach	15</w:t>
-      </w:r>
-    </w:p>
-    <w:p>
-      <w:pPr>
-        <w:tabs>
-          <w:tab w:val="right" w:pos="8660" w:leader="dot"/>
-        </w:tabs>
-        <w:spacing w:after="0" w:before="0" w:line="250"/>
-        <w:ind w:left="440"/>
-      </w:pPr>
-      <w:r>
-        <w:rPr>
-          <w:b w:val="false"/>
-          <w:bCs w:val="false"/>
-          <w:sz w:val="21"/>
-          <w:szCs w:val="21"/>
-        </w:rPr>
-        <w:t xml:space="preserve">6.2  Repository Test Suites	15</w:t>
-      </w:r>
-    </w:p>
-    <w:p>
-      <w:pPr>
-        <w:tabs>
-          <w:tab w:val="right" w:pos="8660" w:leader="dot"/>
-        </w:tabs>
-        <w:spacing w:after="0" w:before="0" w:line="250"/>
-        <w:ind w:left="440"/>
-      </w:pPr>
-      <w:r>
-        <w:rPr>
-          <w:b w:val="false"/>
-          <w:bCs w:val="false"/>
-          <w:sz w:val="21"/>
-          <w:szCs w:val="21"/>
-        </w:rPr>
-        <w:t xml:space="preserve">6.3  Authentication and Authorization Test Cases	15</w:t>
-      </w:r>
-    </w:p>
-    <w:p>
-      <w:pPr>
-        <w:tabs>
-          <w:tab w:val="right" w:pos="8660" w:leader="dot"/>
-        </w:tabs>
-        <w:spacing w:after="20" w:before="50" w:line="250"/>
-        <w:ind w:left="0"/>
-      </w:pPr>
-      <w:r>
-        <w:rPr>
-          <w:b/>
-          <w:bCs/>
-          <w:sz w:val="21"/>
-          <w:szCs w:val="21"/>
-        </w:rPr>
-        <w:t xml:space="preserve">7. TEAM CONTRIBUTIONS AND COLLABORATION	17</w:t>
-      </w:r>
-    </w:p>
-    <w:p>
-      <w:pPr>
-        <w:tabs>
-          <w:tab w:val="right" w:pos="8660" w:leader="dot"/>
-        </w:tabs>
-        <w:spacing w:after="0" w:before="0" w:line="250"/>
-        <w:ind w:left="440"/>
-      </w:pPr>
-      <w:r>
-        <w:rPr>
-          <w:b w:val="false"/>
-          <w:bCs w:val="false"/>
-          <w:sz w:val="21"/>
-          <w:szCs w:val="21"/>
-        </w:rPr>
-        <w:t xml:space="preserve">7.1  Team Structure	17</w:t>
-      </w:r>
-    </w:p>
-    <w:p>
-      <w:pPr>
-        <w:tabs>
-          <w:tab w:val="right" w:pos="8660" w:leader="dot"/>
-        </w:tabs>
-        <w:spacing w:after="0" w:before="0" w:line="250"/>
-        <w:ind w:left="440"/>
-      </w:pPr>
-      <w:r>
-        <w:rPr>
-          <w:b w:val="false"/>
-          <w:bCs w:val="false"/>
-          <w:sz w:val="21"/>
-          <w:szCs w:val="21"/>
-        </w:rPr>
-        <w:t xml:space="preserve">7.2  Member Contributions	17</w:t>
-      </w:r>
-    </w:p>
-    <w:p>
-      <w:pPr>
-        <w:tabs>
-          <w:tab w:val="right" w:pos="8660" w:leader="dot"/>
-        </w:tabs>
-        <w:spacing w:after="0" w:before="0" w:line="250"/>
-        <w:ind w:left="440"/>
-      </w:pPr>
-      <w:r>
-        <w:rPr>
-          <w:b w:val="false"/>
-          <w:bCs w:val="false"/>
-          <w:sz w:val="21"/>
-          <w:szCs w:val="21"/>
-        </w:rPr>
-        <w:t xml:space="preserve">7.3  Repository Evidence	18</w:t>
-      </w:r>
-    </w:p>
-    <w:p>
-      <w:pPr>
-        <w:tabs>
-          <w:tab w:val="right" w:pos="8660" w:leader="dot"/>
-        </w:tabs>
-        <w:spacing w:after="0" w:before="0" w:line="250"/>
-        <w:ind w:left="440"/>
-      </w:pPr>
-      <w:r>
-        <w:rPr>
-          <w:b w:val="false"/>
-          <w:bCs w:val="false"/>
-          <w:sz w:val="21"/>
-          <w:szCs w:val="21"/>
-        </w:rPr>
-        <w:t xml:space="preserve">7.4  Work Allocation Summary	18</w:t>
-      </w:r>
-    </w:p>
-    <w:p>
-      <w:pPr>
-        <w:tabs>
-          <w:tab w:val="right" w:pos="8660" w:leader="dot"/>
-        </w:tabs>
-        <w:spacing w:after="20" w:before="50" w:line="250"/>
-        <w:ind w:left="0"/>
-      </w:pPr>
-      <w:r>
-        <w:rPr>
-          <w:b/>
-          <w:bCs/>
-          <w:sz w:val="21"/>
-          <w:szCs w:val="21"/>
-        </w:rPr>
-        <w:t xml:space="preserve">8. CHALLENGES, OUTCOMES AND LIMITATIONS	20</w:t>
-      </w:r>
-    </w:p>
-    <w:p>
-      <w:pPr>
-        <w:tabs>
-          <w:tab w:val="right" w:pos="8660" w:leader="dot"/>
-        </w:tabs>
-        <w:spacing w:after="0" w:before="0" w:line="250"/>
-        <w:ind w:left="440"/>
-      </w:pPr>
-      <w:r>
-        <w:rPr>
-          <w:b w:val="false"/>
-          <w:bCs w:val="false"/>
-          <w:sz w:val="21"/>
-          <w:szCs w:val="21"/>
-        </w:rPr>
-        <w:t xml:space="preserve">8.1  Challenges and Solutions	20</w:t>
-      </w:r>
-    </w:p>
-    <w:p>
-      <w:pPr>
-        <w:tabs>
-          <w:tab w:val="right" w:pos="8660" w:leader="dot"/>
-        </w:tabs>
-        <w:spacing w:after="0" w:before="0" w:line="250"/>
-        <w:ind w:left="440"/>
-      </w:pPr>
-      <w:r>
-        <w:rPr>
-          <w:b w:val="false"/>
-          <w:bCs w:val="false"/>
-          <w:sz w:val="21"/>
-          <w:szCs w:val="21"/>
-        </w:rPr>
-        <w:t xml:space="preserve">8.2  Project Outcomes	20</w:t>
-      </w:r>
-    </w:p>
-    <w:p>
-      <w:pPr>
-        <w:tabs>
-          <w:tab w:val="right" w:pos="8660" w:leader="dot"/>
-        </w:tabs>
-        <w:spacing w:after="0" w:before="0" w:line="250"/>
-        <w:ind w:left="440"/>
-      </w:pPr>
-      <w:r>
-        <w:rPr>
-          <w:b w:val="false"/>
-          <w:bCs w:val="false"/>
-          <w:sz w:val="21"/>
-          <w:szCs w:val="21"/>
-        </w:rPr>
-        <w:t xml:space="preserve">8.3  Limitations Identified	20</w:t>
-      </w:r>
-    </w:p>
-    <w:p>
-      <w:pPr>
-        <w:tabs>
-          <w:tab w:val="right" w:pos="8660" w:leader="dot"/>
-        </w:tabs>
-        <w:spacing w:after="20" w:before="50" w:line="250"/>
-        <w:ind w:left="0"/>
-      </w:pPr>
-      <w:r>
-        <w:rPr>
-          <w:b/>
-          <w:bCs/>
-          <w:sz w:val="21"/>
-          <w:szCs w:val="21"/>
-        </w:rPr>
-        <w:t xml:space="preserve">9. LEARNING OUTCOMES, CONCLUSION AND FUTURE ENHANCEMENTS	22</w:t>
-      </w:r>
-    </w:p>
-    <w:p>
-      <w:pPr>
-        <w:tabs>
-          <w:tab w:val="right" w:pos="8660" w:leader="dot"/>
-        </w:tabs>
-        <w:spacing w:after="0" w:before="0" w:line="250"/>
-        <w:ind w:left="440"/>
-      </w:pPr>
-      <w:r>
-        <w:rPr>
-          <w:b w:val="false"/>
-          <w:bCs w:val="false"/>
-          <w:sz w:val="21"/>
-          <w:szCs w:val="21"/>
-        </w:rPr>
-        <w:t xml:space="preserve">9.1  Learning Outcomes	22</w:t>
-      </w:r>
-    </w:p>
-    <w:p>
-      <w:pPr>
-        <w:tabs>
-          <w:tab w:val="right" w:pos="8660" w:leader="dot"/>
-        </w:tabs>
-        <w:spacing w:after="0" w:before="0" w:line="250"/>
-        <w:ind w:left="440"/>
-      </w:pPr>
-      <w:r>
-        <w:rPr>
-          <w:b w:val="false"/>
-          <w:bCs w:val="false"/>
-          <w:sz w:val="21"/>
-          <w:szCs w:val="21"/>
-        </w:rPr>
-        <w:t xml:space="preserve">9.2  Conclusion	22</w:t>
-      </w:r>
-    </w:p>
-    <w:p>
-      <w:pPr>
-        <w:tabs>
-          <w:tab w:val="right" w:pos="8660" w:leader="dot"/>
-        </w:tabs>
-        <w:spacing w:after="0" w:before="0" w:line="250"/>
-        <w:ind w:left="440"/>
-      </w:pPr>
-      <w:r>
-        <w:rPr>
-          <w:b w:val="false"/>
-          <w:bCs w:val="false"/>
-          <w:sz w:val="21"/>
-          <w:szCs w:val="21"/>
-        </w:rPr>
-        <w:t xml:space="preserve">9.3  Future Enhancements	22</w:t>
-      </w:r>
-    </w:p>
-    <w:p>
-      <w:pPr>
-        <w:tabs>
-          <w:tab w:val="right" w:pos="8660" w:leader="dot"/>
-        </w:tabs>
-        <w:spacing w:after="20" w:before="50" w:line="250"/>
-        <w:ind w:left="0"/>
-      </w:pPr>
-      <w:r>
-        <w:rPr>
-          <w:b/>
-          <w:bCs/>
-          <w:sz w:val="21"/>
-          <w:szCs w:val="21"/>
-        </w:rPr>
-        <w:t xml:space="preserve">REFERENCES	23</w:t>
+        <w:t xml:space="preserve">REFERENCES	22</w:t>
       </w:r>
     </w:p>
     <w:p>
@@ -1311,7 +1293,7 @@
           <w:sz w:val="20"/>
           <w:szCs w:val="20"/>
         </w:rPr>
-        <w:t xml:space="preserve">Overall ShopSphere system architecture (drawn from the repository structure)	5</w:t>
+        <w:t xml:space="preserve">Overall ShopSphere system architecture (drawn from the repository structure)	4</w:t>
       </w:r>
     </w:p>
     <w:p>
@@ -1336,7 +1318,7 @@
           <w:sz w:val="20"/>
           <w:szCs w:val="20"/>
         </w:rPr>
-        <w:t xml:space="preserve">Principal collections and relationships (from backend/models/*.model.js)	6</w:t>
+        <w:t xml:space="preserve">Principal collections and relationships (from backend/models/*.model.js)	5</w:t>
       </w:r>
     </w:p>
     <w:p>
@@ -1361,7 +1343,7 @@
           <w:sz w:val="20"/>
           <w:szCs w:val="20"/>
         </w:rPr>
-        <w:t xml:space="preserve">Customer home page after sign-in	7</w:t>
+        <w:t xml:space="preserve">Customer home page after sign-in	6</w:t>
       </w:r>
     </w:p>
     <w:p>
@@ -1386,7 +1368,7 @@
           <w:sz w:val="20"/>
           <w:szCs w:val="20"/>
         </w:rPr>
-        <w:t xml:space="preserve">Product details page	7</w:t>
+        <w:t xml:space="preserve">Product details page	6</w:t>
       </w:r>
     </w:p>
     <w:p>
@@ -1411,7 +1393,7 @@
           <w:sz w:val="20"/>
           <w:szCs w:val="20"/>
         </w:rPr>
-        <w:t xml:space="preserve">Shopping cart with order summary	7</w:t>
+        <w:t xml:space="preserve">Shopping cart with order summary	6</w:t>
       </w:r>
     </w:p>
     <w:p>
@@ -1436,7 +1418,7 @@
           <w:sz w:val="20"/>
           <w:szCs w:val="20"/>
         </w:rPr>
-        <w:t xml:space="preserve">Checkout with saved addresses	7</w:t>
+        <w:t xml:space="preserve">Checkout with saved addresses	6</w:t>
       </w:r>
     </w:p>
     <w:p>
@@ -1461,7 +1443,7 @@
           <w:sz w:val="20"/>
           <w:szCs w:val="20"/>
         </w:rPr>
-        <w:t xml:space="preserve">My Orders inside the account area	7</w:t>
+        <w:t xml:space="preserve">My Orders inside the account area	6</w:t>
       </w:r>
     </w:p>
     <w:p>
@@ -1486,7 +1468,7 @@
           <w:sz w:val="20"/>
           <w:szCs w:val="20"/>
         </w:rPr>
-        <w:t xml:space="preserve">Order tracking timeline (ORD-1021)	7</w:t>
+        <w:t xml:space="preserve">Order tracking timeline (ORD-1021)	6</w:t>
       </w:r>
     </w:p>
     <w:p>
@@ -1511,7 +1493,7 @@
           <w:sz w:val="20"/>
           <w:szCs w:val="20"/>
         </w:rPr>
-        <w:t xml:space="preserve">Seller dashboard (TechNova Electronics demo store)	8</w:t>
+        <w:t xml:space="preserve">Seller dashboard (TechNova Electronics demo store)	7</w:t>
       </w:r>
     </w:p>
     <w:p>
@@ -1536,7 +1518,7 @@
           <w:sz w:val="20"/>
           <w:szCs w:val="20"/>
         </w:rPr>
-        <w:t xml:space="preserve">Seller product and stock management	8</w:t>
+        <w:t xml:space="preserve">Seller product and stock management	7</w:t>
       </w:r>
     </w:p>
     <w:p>
@@ -1561,7 +1543,7 @@
           <w:sz w:val="20"/>
           <w:szCs w:val="20"/>
         </w:rPr>
-        <w:t xml:space="preserve">Seller verification queue with submitted documents	8</w:t>
+        <w:t xml:space="preserve">Seller verification queue with submitted documents	7</w:t>
       </w:r>
     </w:p>
     <w:p>
@@ -1586,7 +1568,7 @@
           <w:sz w:val="20"/>
           <w:szCs w:val="20"/>
         </w:rPr>
-        <w:t xml:space="preserve">Product approval queue	8</w:t>
+        <w:t xml:space="preserve">Product approval queue	7</w:t>
       </w:r>
     </w:p>
     <w:p>
@@ -1611,7 +1593,7 @@
           <w:sz w:val="20"/>
           <w:szCs w:val="20"/>
         </w:rPr>
-        <w:t xml:space="preserve">Admin delivery assignment by PIN-code eligibility	9</w:t>
+        <w:t xml:space="preserve">Admin delivery assignment by PIN-code eligibility	8</w:t>
       </w:r>
     </w:p>
     <w:p>
@@ -1636,7 +1618,7 @@
           <w:sz w:val="20"/>
           <w:szCs w:val="20"/>
         </w:rPr>
-        <w:t xml:space="preserve">Delivery console for a signed-in partner	9</w:t>
+        <w:t xml:space="preserve">Delivery console for a signed-in partner	8</w:t>
       </w:r>
     </w:p>
     <w:p>
@@ -1661,7 +1643,7 @@
           <w:sz w:val="20"/>
           <w:szCs w:val="20"/>
         </w:rPr>
-        <w:t xml:space="preserve">Seller onboarding and product approval workflow	9</w:t>
+        <w:t xml:space="preserve">Seller onboarding and product approval workflow	8</w:t>
       </w:r>
     </w:p>
     <w:p>
@@ -1686,7 +1668,7 @@
           <w:sz w:val="20"/>
           <w:szCs w:val="20"/>
         </w:rPr>
-        <w:t xml:space="preserve">Order lifecycle across customer, seller, admin and delivery roles	9</w:t>
+        <w:t xml:space="preserve">Order lifecycle across customer, seller, admin and delivery roles	8</w:t>
       </w:r>
     </w:p>
     <w:p>
@@ -1711,7 +1693,7 @@
           <w:sz w:val="20"/>
           <w:szCs w:val="20"/>
         </w:rPr>
-        <w:t xml:space="preserve">Authentication flow from the shared login to a role portal	12</w:t>
+        <w:t xml:space="preserve">Authentication flow from the shared login to a role portal	11</w:t>
       </w:r>
     </w:p>
     <w:p>
@@ -1736,7 +1718,7 @@
           <w:sz w:val="20"/>
           <w:szCs w:val="20"/>
         </w:rPr>
-        <w:t xml:space="preserve">Shared login: role chooser (port 5177)	12</w:t>
+        <w:t xml:space="preserve">Shared login: role chooser (port 5177)	11</w:t>
       </w:r>
     </w:p>
     <w:p>
@@ -1761,7 +1743,7 @@
           <w:sz w:val="20"/>
           <w:szCs w:val="20"/>
         </w:rPr>
-        <w:t xml:space="preserve">Role-specific sign-in screen	12</w:t>
+        <w:t xml:space="preserve">Role-specific sign-in screen	11</w:t>
       </w:r>
     </w:p>
     <w:p>
@@ -1786,7 +1768,7 @@
           <w:sz w:val="20"/>
           <w:szCs w:val="20"/>
         </w:rPr>
-        <w:t xml:space="preserve">Generic error for an invalid password	13</w:t>
+        <w:t xml:space="preserve">Generic error for an invalid password	12</w:t>
       </w:r>
     </w:p>
     <w:p>
@@ -1811,7 +1793,7 @@
           <w:sz w:val="20"/>
           <w:szCs w:val="20"/>
         </w:rPr>
-        <w:t xml:space="preserve">Unauthenticated admin visit redirected to admin sign-in	13</w:t>
+        <w:t xml:space="preserve">Unauthenticated admin visit redirected to admin sign-in	12</w:t>
       </w:r>
     </w:p>
     <w:p>
@@ -1836,7 +1818,7 @@
           <w:sz w:val="20"/>
           <w:szCs w:val="20"/>
         </w:rPr>
-        <w:t xml:space="preserve">Server-side authorization pipeline and rejection responses	13</w:t>
+        <w:t xml:space="preserve">Server-side authorization pipeline and rejection responses	12</w:t>
       </w:r>
     </w:p>
     <w:p>
@@ -1875,7 +1857,7 @@
           <w:sz w:val="20"/>
           <w:szCs w:val="20"/>
         </w:rPr>
-        <w:t xml:space="preserve">Software requirements and development environment (from README.md and package.json files)	3</w:t>
+        <w:t xml:space="preserve">Software requirements and development environment (from README.md and package.json files)	2</w:t>
       </w:r>
     </w:p>
     <w:p>
@@ -1900,7 +1882,7 @@
           <w:sz w:val="20"/>
           <w:szCs w:val="20"/>
         </w:rPr>
-        <w:t xml:space="preserve">Technology stack confirmed in the repository	4</w:t>
+        <w:t xml:space="preserve">Technology stack confirmed in the repository	3</w:t>
       </w:r>
     </w:p>
     <w:p>
@@ -1925,7 +1907,7 @@
           <w:sz w:val="20"/>
           <w:szCs w:val="20"/>
         </w:rPr>
-        <w:t xml:space="preserve">Authorization guards and where they are applied	13</w:t>
+        <w:t xml:space="preserve">Authorization guards and where they are applied	12</w:t>
       </w:r>
     </w:p>
     <w:p>
@@ -1950,7 +1932,7 @@
           <w:sz w:val="20"/>
           <w:szCs w:val="20"/>
         </w:rPr>
-        <w:t xml:space="preserve">Results of the repository test scripts (backend/test, run on 21 October 2026)	15</w:t>
+        <w:t xml:space="preserve">Results of the repository test scripts (backend/test, run on 21 October 2026)	14</w:t>
       </w:r>
     </w:p>
     <w:p>
@@ -1975,7 +1957,7 @@
           <w:sz w:val="20"/>
           <w:szCs w:val="20"/>
         </w:rPr>
-        <w:t xml:space="preserve">Authentication and authorization checks (expected vs. observed)	15</w:t>
+        <w:t xml:space="preserve">Authentication and authorization checks (expected vs. observed)	14</w:t>
       </w:r>
     </w:p>
     <w:p>
@@ -2000,7 +1982,7 @@
           <w:sz w:val="20"/>
           <w:szCs w:val="20"/>
         </w:rPr>
-        <w:t xml:space="preserve">Team members and responsibilities — Ctrl+Alt+Win and Femme Forces	17</w:t>
+        <w:t xml:space="preserve">Team members and responsibilities — Ctrl+Alt+Win and Femme Forces	16</w:t>
       </w:r>
     </w:p>
     <w:p>
@@ -2025,7 +2007,7 @@
           <w:sz w:val="20"/>
           <w:szCs w:val="20"/>
         </w:rPr>
-        <w:t xml:space="preserve">Notable commits in the shared repository	18</w:t>
+        <w:t xml:space="preserve">Notable commits in the shared repository	17</w:t>
       </w:r>
     </w:p>
     <w:p>
@@ -2050,7 +2032,7 @@
           <w:sz w:val="20"/>
           <w:szCs w:val="20"/>
         </w:rPr>
-        <w:t xml:space="preserve">Recurring task areas per member in the work-allocation calendar (days allocated in brackets)	19</w:t>
+        <w:t xml:space="preserve">Recurring task areas per member in the work-allocation calendar (days allocated in brackets)	18</w:t>
       </w:r>
     </w:p>
     <w:p>
@@ -2075,7 +2057,7 @@
           <w:sz w:val="20"/>
           <w:szCs w:val="20"/>
         </w:rPr>
-        <w:t xml:space="preserve">Project phases reconstructed from repository history and the allocation workbook	19</w:t>
+        <w:t xml:space="preserve">Project phases reconstructed from repository history and the allocation workbook	18</w:t>
       </w:r>
     </w:p>
     <w:p>
@@ -2113,7 +2095,7 @@
           <w:szCs w:val="30"/>
         </w:rPr>
         <w:br/>
-        <w:t xml:space="preserve">INTRODUCTION AND COMPANY PROFILE</w:t>
+        <w:t xml:space="preserve">INTRODUCTION</w:t>
       </w:r>
     </w:p>
     <w:p>
@@ -2213,51 +2195,7 @@
           <w:sz w:val="26"/>
           <w:szCs w:val="26"/>
         </w:rPr>
-        <w:t xml:space="preserve">1.2  Company Profile</w:t>
-      </w:r>
-    </w:p>
-    <w:p>
-      <w:pPr>
-        <w:spacing w:after="100" w:before="0" w:line="288"/>
-        <w:jc w:val="both"/>
-      </w:pPr>
-      <w:r>
-        <w:t xml:space="preserve">TechPower Solutions is an information technology company located at #05, 1st Floor, 100 Feet Road, Vadapalani, Chennai – 600 026, Tamil Nadu (website: www.techpowersolutions.in). The organisation works in software development, technical training, industrial internships and project-based learning, with the stated aim of bridging the gap between academic education and industry requirements. Its training areas include Full Stack and MERN Stack Development, Artificial Intelligence, Machine Learning, Data Analytics, Cloud Computing, the Internet of Things, Mobile Application Development, Python, Java and Software Testing.</w:t>
-      </w:r>
-    </w:p>
-    <w:p>
-      <w:pPr>
-        <w:spacing w:after="100" w:before="0" w:line="288"/>
-        <w:jc w:val="both"/>
-      </w:pPr>
-      <w:r>
-        <w:t xml:space="preserve">The company follows a structured Software Development Life Cycle (requirement analysis, design, development, testing, deployment and maintenance) for its internship projects. Internship programmes are coordinated by </w:t>
-      </w:r>
-      <w:r>
-        <w:rPr>
-          <w:b/>
-          <w:bCs/>
-        </w:rPr>
-        <w:t xml:space="preserve">Mr. Gokul E, HR Manager</w:t>
-      </w:r>
-      <w:r>
-        <w:t xml:space="preserve">, who handles student onboarding, training schedules and professional guidance during the internship period.</w:t>
-      </w:r>
-    </w:p>
-    <w:p>
-      <w:pPr>
-        <w:pStyle w:val="Heading2"/>
-        <w:keepNext/>
-        <w:spacing w:after="100" w:before="200"/>
-      </w:pPr>
-      <w:r>
-        <w:rPr>
-          <w:b/>
-          <w:bCs/>
-          <w:sz w:val="26"/>
-          <w:szCs w:val="26"/>
-        </w:rPr>
-        <w:t xml:space="preserve">1.3  Objectives of the Internship</w:t>
+        <w:t xml:space="preserve">1.2  Objectives of the Internship</w:t>
       </w:r>
     </w:p>
     <w:p>
@@ -2343,7 +2281,7 @@
           <w:sz w:val="26"/>
           <w:szCs w:val="26"/>
         </w:rPr>
-        <w:t xml:space="preserve">1.4  Scope and Organisation of the Report</w:t>
+        <w:t xml:space="preserve">1.3  Scope and Organisation of the Report</w:t>
       </w:r>
     </w:p>
     <w:p>
@@ -3068,39 +3006,7 @@
                 <w:sz w:val="20"/>
                 <w:szCs w:val="20"/>
               </w:rPr>
-              <w:t xml:space="preserve">backend/.env: PORT, MONGO</w:t>
-            </w:r>
-            <w:r>
-              <w:rPr>
-                <w:i/>
-                <w:iCs/>
-                <w:sz w:val="20"/>
-                <w:szCs w:val="20"/>
-              </w:rPr>
-              <w:t xml:space="preserve">URI, JWT</w:t>
-            </w:r>
-            <w:r>
-              <w:rPr>
-                <w:sz w:val="20"/>
-                <w:szCs w:val="20"/>
-              </w:rPr>
-              <w:t xml:space="preserve">SECRET, LOGIN</w:t>
-            </w:r>
-            <w:r>
-              <w:rPr>
-                <w:i/>
-                <w:iCs/>
-                <w:sz w:val="20"/>
-                <w:szCs w:val="20"/>
-              </w:rPr>
-              <w:t xml:space="preserve">APP</w:t>
-            </w:r>
-            <w:r>
-              <w:rPr>
-                <w:sz w:val="20"/>
-                <w:szCs w:val="20"/>
-              </w:rPr>
-              <w:t xml:space="preserve">URL; optional SMTP_* and Razorpay test keys</w:t>
+              <w:t xml:space="preserve">backend/.env: PORT, MONGO_URI, JWT_SECRET, LOGIN_APP_URL; optional SMTP_* and Razorpay test keys</w:t>
             </w:r>
           </w:p>
         </w:tc>
@@ -9701,39 +9607,7 @@
                 <w:sz w:val="20"/>
                 <w:szCs w:val="20"/>
               </w:rPr>
-              <w:t xml:space="preserve">verify</w:t>
-            </w:r>
-            <w:r>
-              <w:rPr>
-                <w:i/>
-                <w:iCs/>
-                <w:sz w:val="20"/>
-                <w:szCs w:val="20"/>
-              </w:rPr>
-              <w:t xml:space="preserve">changes</w:t>
-            </w:r>
-            <w:r>
-              <w:rPr>
-                <w:sz w:val="20"/>
-                <w:szCs w:val="20"/>
-              </w:rPr>
-              <w:t xml:space="preserve">1</w:t>
-            </w:r>
-            <w:r>
-              <w:rPr>
-                <w:i/>
-                <w:iCs/>
-                <w:sz w:val="20"/>
-                <w:szCs w:val="20"/>
-              </w:rPr>
-              <w:t xml:space="preserve">to</w:t>
-            </w:r>
-            <w:r>
-              <w:rPr>
-                <w:sz w:val="20"/>
-                <w:szCs w:val="20"/>
-              </w:rPr>
-              <w:t xml:space="preserve">10.js</w:t>
+              <w:t xml:space="preserve">verify_changes_1_to_10.js</w:t>
             </w:r>
           </w:p>
         </w:tc>
@@ -16154,52 +16028,20 @@
           <w:sz w:val="22"/>
           <w:szCs w:val="22"/>
         </w:rPr>
-        <w:t xml:space="preserve">[12]  OWASP Foundation, “Authentication Cheat Sheet.” https://cheatsheetseries.owasp.org/cheatsheets/Authentication</w:t>
-      </w:r>
-      <w:r>
-        <w:rPr>
-          <w:i/>
-          <w:iCs/>
+        <w:t xml:space="preserve">[12]  OWASP Foundation, “Authentication Cheat Sheet.” https://cheatsheetseries.owasp.org/cheatsheets/Authentication_Cheat_Sheet.html</w:t>
+      </w:r>
+    </w:p>
+    <w:p>
+      <w:pPr>
+        <w:spacing w:after="80" w:line="264"/>
+        <w:ind w:left="480" w:hanging="480"/>
+      </w:pPr>
+      <w:r>
+        <w:rPr>
           <w:sz w:val="22"/>
           <w:szCs w:val="22"/>
         </w:rPr>
-        <w:t xml:space="preserve">Cheat</w:t>
-      </w:r>
-      <w:r>
-        <w:rPr>
-          <w:sz w:val="22"/>
-          <w:szCs w:val="22"/>
-        </w:rPr>
-        <w:t xml:space="preserve">Sheet.html</w:t>
-      </w:r>
-    </w:p>
-    <w:p>
-      <w:pPr>
-        <w:spacing w:after="80" w:line="264"/>
-        <w:ind w:left="480" w:hanging="480"/>
-      </w:pPr>
-      <w:r>
-        <w:rPr>
-          <w:sz w:val="22"/>
-          <w:szCs w:val="22"/>
-        </w:rPr>
-        <w:t xml:space="preserve">[13]  OWASP Foundation, “HTML5 Security Cheat Sheet — Local Storage.” https://cheatsheetseries.owasp.org/cheatsheets/HTML5</w:t>
-      </w:r>
-      <w:r>
-        <w:rPr>
-          <w:i/>
-          <w:iCs/>
-          <w:sz w:val="22"/>
-          <w:szCs w:val="22"/>
-        </w:rPr>
-        <w:t xml:space="preserve">Security</w:t>
-      </w:r>
-      <w:r>
-        <w:rPr>
-          <w:sz w:val="22"/>
-          <w:szCs w:val="22"/>
-        </w:rPr>
-        <w:t xml:space="preserve">Cheat_Sheet.html</w:t>
+        <w:t xml:space="preserve">[13]  OWASP Foundation, “HTML5 Security Cheat Sheet — Local Storage.” https://cheatsheetseries.owasp.org/cheatsheets/HTML5_Security_Cheat_Sheet.html</w:t>
       </w:r>
     </w:p>
     <w:p>

</xml_diff>

<commit_message>
Report: 30 pages; Niraimathi as supporting contributor; drop Harini reference
Adds Appendix B (running the project locally).

Co-Authored-By: Claude Opus 5.5 <noreply@anthropic.com>
Claude-Session: https://claude.ai/code/session_01SefLkeJGfqSPbmYLA9m1RC
</commit_message>
<xml_diff>
--- a/docs/internship-report/SHOPSPHERE_TEAM_INTERNSHIP_REPORT.docx
+++ b/docs/internship-report/SHOPSPHERE_TEAM_INTERNSHIP_REPORT.docx
@@ -1264,6 +1264,24 @@
     </w:p>
     <w:p>
       <w:pPr>
+        <w:tabs>
+          <w:tab w:val="right" w:pos="8660" w:leader="dot"/>
+        </w:tabs>
+        <w:spacing w:after="20" w:before="50" w:line="250"/>
+        <w:ind w:left="0"/>
+      </w:pPr>
+      <w:r>
+        <w:rPr>
+          <w:b/>
+          <w:bCs/>
+          <w:sz w:val="21"/>
+          <w:szCs w:val="21"/>
+        </w:rPr>
+        <w:t xml:space="preserve">APPENDIX B  RUNNING THE PROJECT LOCALLY	26</w:t>
+      </w:r>
+    </w:p>
+    <w:p>
+      <w:pPr>
         <w:pageBreakBefore/>
         <w:spacing w:after="300"/>
         <w:jc w:val="center"/>
@@ -2229,6 +2247,31 @@
           <w:szCs w:val="20"/>
         </w:rPr>
         <w:t xml:space="preserve">Administrator console accounts (http://localhost:5173)	24</w:t>
+      </w:r>
+    </w:p>
+    <w:p>
+      <w:pPr>
+        <w:tabs>
+          <w:tab w:val="right" w:pos="8660" w:leader="dot"/>
+        </w:tabs>
+        <w:spacing w:after="10"/>
+        <w:ind w:left="1000" w:hanging="1000"/>
+      </w:pPr>
+      <w:r>
+        <w:rPr>
+          <w:b/>
+          <w:bCs/>
+          <w:sz w:val="20"/>
+          <w:szCs w:val="20"/>
+        </w:rPr>
+        <w:t xml:space="preserve">Table B.1  </w:t>
+      </w:r>
+      <w:r>
+        <w:rPr>
+          <w:sz w:val="20"/>
+          <w:szCs w:val="20"/>
+        </w:rPr>
+        <w:t xml:space="preserve">Applications and their local addresses	26</w:t>
       </w:r>
     </w:p>
     <w:p>
@@ -13709,7 +13752,7 @@
         <w:t xml:space="preserve">Femme Forces</w:t>
       </w:r>
       <w:r>
-        <w:t xml:space="preserve">. Work was divided by module: three members acted as main contributors with ownership of a core area, one member supported the seller module, and two members carried out limited, bounded testing and evidence tasks. Table 7.1 summarises the responsibilities recorded in the team’s Task Assignment sheet.</w:t>
+        <w:t xml:space="preserve">. Work was divided by module: three members acted as main contributors with ownership of a core area, two members supported the seller module and the delivery workflow, and one member carried out limited testing and evidence tasks. Table 7.1 summarises the responsibilities recorded in the team’s Task Assignment sheet.</w:t>
       </w:r>
     </w:p>
     <w:p>
@@ -14413,7 +14456,7 @@
                 <w:sz w:val="19"/>
                 <w:szCs w:val="19"/>
               </w:rPr>
-              <w:t xml:space="preserve">Light support</w:t>
+              <w:t xml:space="preserve">Supporting contributor</w:t>
             </w:r>
           </w:p>
         </w:tc>
@@ -14444,7 +14487,7 @@
                 <w:sz w:val="19"/>
                 <w:szCs w:val="19"/>
               </w:rPr>
-              <w:t xml:space="preserve">Occasional delivery-workflow checks, screenshots and simple QA notes</w:t>
+              <w:t xml:space="preserve">Delivery-workflow checks, screenshots and QA notes</w:t>
             </w:r>
           </w:p>
         </w:tc>
@@ -14624,10 +14667,10 @@
           <w:b/>
           <w:bCs/>
         </w:rPr>
-        <w:t xml:space="preserve">Niraimathi V — delivery checks (light).</w:t>
-      </w:r>
-      <w:r>
-        <w:t xml:space="preserve"> Occasional delivery-status and navigation spot-checks, cross-role status-label comparison, simple form checks and help with labelling report evidence.</w:t>
+        <w:t xml:space="preserve">Niraimathi V — delivery workflow checks (supporting).</w:t>
+      </w:r>
+      <w:r>
+        <w:t xml:space="preserve"> Delivery-status and navigation checks, cross-role status-label comparison, simple form checks and help with labelling report evidence.</w:t>
       </w:r>
     </w:p>
     <w:p>
@@ -15600,29 +15643,7 @@
         <w:jc w:val="both"/>
       </w:pPr>
       <w:r>
-        <w:t xml:space="preserve">Earlier commits (26 June – 13 July 2026) by the accounts “Blueundead24” and “Harini-G-07” created the initial project structure, the first login API, the delivery app and the user-account module, including the original </w:t>
-      </w:r>
-      <w:r>
-        <w:rPr>
-          <w:rFonts w:ascii="Consolas" w:cs="Consolas" w:eastAsia="Consolas" w:hAnsi="Consolas"/>
-          <w:sz w:val="21"/>
-          <w:szCs w:val="21"/>
-        </w:rPr>
-        <w:t xml:space="preserve">requireAuth</w:t>
-      </w:r>
-      <w:r>
-        <w:t xml:space="preserve"> and </w:t>
-      </w:r>
-      <w:r>
-        <w:rPr>
-          <w:rFonts w:ascii="Consolas" w:cs="Consolas" w:eastAsia="Consolas" w:hAnsi="Consolas"/>
-          <w:sz w:val="21"/>
-          <w:szCs w:val="21"/>
-        </w:rPr>
-        <w:t xml:space="preserve">requireSelfOrAdmin</w:t>
-      </w:r>
-      <w:r>
-        <w:t xml:space="preserve"> guards; these accounts are not mapped to team members in the allocation workbook.</w:t>
+        <w:t xml:space="preserve">Earlier commits (26 June – 4 July 2026) by the account “Blueundead24” created the initial project structure, the first login API and the delivery app; this account is not mapped to a team member in the allocation workbook.</w:t>
       </w:r>
     </w:p>
     <w:p>
@@ -16171,7 +16192,7 @@
                 <w:sz w:val="19"/>
                 <w:szCs w:val="19"/>
               </w:rPr>
-              <w:t xml:space="preserve">Cross-role display check (5), light regression support (5), delivery UI and journey spot-checks, report evidence and handover support (3–4 each)</w:t>
+              <w:t xml:space="preserve">Cross-role display check (5), regression support (5), delivery UI and journey spot-checks, report evidence and handover support (3–4 each)</w:t>
             </w:r>
           </w:p>
         </w:tc>
@@ -16393,7 +16414,7 @@
                 <w:sz w:val="19"/>
                 <w:szCs w:val="19"/>
               </w:rPr>
-              <w:t xml:space="preserve">Onboarding and MERN training; initial project set-up, common login, first backend APIs and user-account module</w:t>
+              <w:t xml:space="preserve">Onboarding and MERN training; initial project set-up, common login and first backend APIs</w:t>
             </w:r>
           </w:p>
         </w:tc>
@@ -16424,7 +16445,7 @@
                 <w:sz w:val="19"/>
                 <w:szCs w:val="19"/>
               </w:rPr>
-              <w:t xml:space="preserve">Commits 26 Jun – 13 Jul</w:t>
+              <w:t xml:space="preserve">Commits 26 Jun – 4 Jul</w:t>
             </w:r>
           </w:p>
         </w:tc>
@@ -32060,6 +32081,1231 @@
                 <w:szCs w:val="16"/>
               </w:rPr>
               <w:t xml:space="preserve">Escalations Manager</w:t>
+            </w:r>
+          </w:p>
+        </w:tc>
+      </w:tr>
+    </w:tbl>
+    <w:p>
+      <w:pPr>
+        <w:spacing w:after="120"/>
+      </w:pPr>
+    </w:p>
+    <w:p>
+      <w:pPr>
+        <w:pStyle w:val="Heading1"/>
+        <w:pageBreakBefore/>
+        <w:spacing w:after="240"/>
+        <w:jc w:val="center"/>
+      </w:pPr>
+      <w:r>
+        <w:rPr>
+          <w:b/>
+          <w:bCs/>
+          <w:sz w:val="30"/>
+          <w:szCs w:val="30"/>
+        </w:rPr>
+        <w:t xml:space="preserve">APPENDIX B  RUNNING THE PROJECT LOCALLY</w:t>
+      </w:r>
+    </w:p>
+    <w:p>
+      <w:pPr>
+        <w:spacing w:after="100" w:before="0" w:line="288"/>
+        <w:jc w:val="both"/>
+      </w:pPr>
+      <w:r>
+        <w:t xml:space="preserve">These steps reproduce the environment used for the screenshots and tests in this report. They follow the repository’s README.md and package.json scripts.</w:t>
+      </w:r>
+    </w:p>
+    <w:p>
+      <w:pPr>
+        <w:pStyle w:val="Heading3"/>
+        <w:keepNext/>
+        <w:spacing w:after="60" w:before="140"/>
+      </w:pPr>
+      <w:r>
+        <w:rPr>
+          <w:b/>
+          <w:bCs/>
+          <w:sz w:val="24"/>
+          <w:szCs w:val="24"/>
+        </w:rPr>
+        <w:t xml:space="preserve">B.1  Prerequisites</w:t>
+      </w:r>
+    </w:p>
+    <w:p>
+      <w:pPr>
+        <w:pStyle w:val="ListParagraph"/>
+        <w:numPr>
+          <w:ilvl w:val="0"/>
+          <w:numId w:val="2"/>
+        </w:numPr>
+        <w:spacing w:after="50" w:line="276"/>
+        <w:jc w:val="both"/>
+      </w:pPr>
+      <w:r>
+        <w:t xml:space="preserve">Node.js version 20 or later, with npm.</w:t>
+      </w:r>
+    </w:p>
+    <w:p>
+      <w:pPr>
+        <w:pStyle w:val="ListParagraph"/>
+        <w:numPr>
+          <w:ilvl w:val="0"/>
+          <w:numId w:val="2"/>
+        </w:numPr>
+        <w:spacing w:after="50" w:line="276"/>
+        <w:jc w:val="both"/>
+      </w:pPr>
+      <w:r>
+        <w:t xml:space="preserve">MongoDB running locally at mongodb://127.0.0.1:27017 (any recent version; MongoDB 7 was used here), or a remote MongoDB URI.</w:t>
+      </w:r>
+    </w:p>
+    <w:p>
+      <w:pPr>
+        <w:pStyle w:val="ListParagraph"/>
+        <w:numPr>
+          <w:ilvl w:val="0"/>
+          <w:numId w:val="2"/>
+        </w:numPr>
+        <w:spacing w:after="50" w:line="276"/>
+        <w:jc w:val="both"/>
+      </w:pPr>
+      <w:r>
+        <w:t xml:space="preserve">Git, and a modern web browser.</w:t>
+      </w:r>
+    </w:p>
+    <w:p>
+      <w:pPr>
+        <w:pStyle w:val="Heading3"/>
+        <w:keepNext/>
+        <w:spacing w:after="60" w:before="140"/>
+      </w:pPr>
+      <w:r>
+        <w:rPr>
+          <w:b/>
+          <w:bCs/>
+          <w:sz w:val="24"/>
+          <w:szCs w:val="24"/>
+        </w:rPr>
+        <w:t xml:space="preserve">B.2  Installation and start-up</w:t>
+      </w:r>
+    </w:p>
+    <w:p>
+      <w:pPr>
+        <w:pStyle w:val="ListParagraph"/>
+        <w:numPr>
+          <w:ilvl w:val="0"/>
+          <w:numId w:val="4"/>
+        </w:numPr>
+        <w:spacing w:after="50" w:line="276"/>
+        <w:jc w:val="both"/>
+      </w:pPr>
+      <w:r>
+        <w:t xml:space="preserve">Clone the repository and open the project folder.</w:t>
+      </w:r>
+    </w:p>
+    <w:p>
+      <w:pPr>
+        <w:pStyle w:val="ListParagraph"/>
+        <w:numPr>
+          <w:ilvl w:val="0"/>
+          <w:numId w:val="4"/>
+        </w:numPr>
+        <w:spacing w:after="50" w:line="276"/>
+        <w:jc w:val="both"/>
+      </w:pPr>
+      <w:r>
+        <w:t xml:space="preserve">Install the root tools and the dependencies of the backend and all five front-ends.</w:t>
+      </w:r>
+    </w:p>
+    <w:p>
+      <w:pPr>
+        <w:pStyle w:val="ListParagraph"/>
+        <w:numPr>
+          <w:ilvl w:val="0"/>
+          <w:numId w:val="4"/>
+        </w:numPr>
+        <w:spacing w:after="50" w:line="276"/>
+        <w:jc w:val="both"/>
+      </w:pPr>
+      <w:r>
+        <w:t xml:space="preserve">Create </w:t>
+      </w:r>
+      <w:r>
+        <w:rPr>
+          <w:rFonts w:ascii="Consolas" w:cs="Consolas" w:eastAsia="Consolas" w:hAnsi="Consolas"/>
+          <w:sz w:val="21"/>
+          <w:szCs w:val="21"/>
+        </w:rPr>
+        <w:t xml:space="preserve">backend/.env</w:t>
+      </w:r>
+      <w:r>
+        <w:t xml:space="preserve"> from </w:t>
+      </w:r>
+      <w:r>
+        <w:rPr>
+          <w:rFonts w:ascii="Consolas" w:cs="Consolas" w:eastAsia="Consolas" w:hAnsi="Consolas"/>
+          <w:sz w:val="21"/>
+          <w:szCs w:val="21"/>
+        </w:rPr>
+        <w:t xml:space="preserve">backend/.env.example</w:t>
+      </w:r>
+      <w:r>
+        <w:t xml:space="preserve"> and set </w:t>
+      </w:r>
+      <w:r>
+        <w:rPr>
+          <w:rFonts w:ascii="Consolas" w:cs="Consolas" w:eastAsia="Consolas" w:hAnsi="Consolas"/>
+          <w:sz w:val="21"/>
+          <w:szCs w:val="21"/>
+        </w:rPr>
+        <w:t xml:space="preserve">MONGO_URI</w:t>
+      </w:r>
+      <w:r>
+        <w:t xml:space="preserve">, a long random </w:t>
+      </w:r>
+      <w:r>
+        <w:rPr>
+          <w:rFonts w:ascii="Consolas" w:cs="Consolas" w:eastAsia="Consolas" w:hAnsi="Consolas"/>
+          <w:sz w:val="21"/>
+          <w:szCs w:val="21"/>
+        </w:rPr>
+        <w:t xml:space="preserve">JWT_SECRET</w:t>
+      </w:r>
+      <w:r>
+        <w:t xml:space="preserve"> and </w:t>
+      </w:r>
+      <w:r>
+        <w:rPr>
+          <w:rFonts w:ascii="Consolas" w:cs="Consolas" w:eastAsia="Consolas" w:hAnsi="Consolas"/>
+          <w:sz w:val="21"/>
+          <w:szCs w:val="21"/>
+        </w:rPr>
+        <w:t xml:space="preserve">LOGIN_APP_URL</w:t>
+      </w:r>
+      <w:r>
+        <w:t xml:space="preserve">. SMTP and Razorpay test keys are optional.</w:t>
+      </w:r>
+    </w:p>
+    <w:p>
+      <w:pPr>
+        <w:pStyle w:val="ListParagraph"/>
+        <w:numPr>
+          <w:ilvl w:val="0"/>
+          <w:numId w:val="4"/>
+        </w:numPr>
+        <w:spacing w:after="50" w:line="276"/>
+        <w:jc w:val="both"/>
+      </w:pPr>
+      <w:r>
+        <w:t xml:space="preserve">Start the backend and the five portals together. On first start the backend seeds the database with the demo catalogue, orders and the accounts in Appendix A.</w:t>
+      </w:r>
+    </w:p>
+    <w:p>
+      <w:pPr>
+        <w:pStyle w:val="ListParagraph"/>
+        <w:numPr>
+          <w:ilvl w:val="0"/>
+          <w:numId w:val="4"/>
+        </w:numPr>
+        <w:spacing w:after="50" w:line="276"/>
+        <w:jc w:val="both"/>
+      </w:pPr>
+      <w:r>
+        <w:t xml:space="preserve">Open the shared login at http://localhost:5177, choose a role and sign in with an account from Appendix A.</w:t>
+      </w:r>
+    </w:p>
+    <w:p>
+      <w:pPr>
+        <w:spacing w:after="60"/>
+      </w:pPr>
+    </w:p>
+    <w:tbl>
+      <w:tblPr>
+        <w:tblW w:type="dxa" w:w="8666"/>
+        <w:tblBorders>
+          <w:top w:val="single" w:color="auto" w:sz="4"/>
+          <w:left w:val="single" w:color="auto" w:sz="4"/>
+          <w:bottom w:val="single" w:color="auto" w:sz="4"/>
+          <w:right w:val="single" w:color="auto" w:sz="4"/>
+          <w:insideH w:val="single" w:color="auto" w:sz="4"/>
+          <w:insideV w:val="single" w:color="auto" w:sz="4"/>
+        </w:tblBorders>
+      </w:tblPr>
+      <w:tblGrid>
+        <w:gridCol w:w="8666"/>
+      </w:tblGrid>
+      <w:tr>
+        <w:trPr>
+          <w:cantSplit/>
+        </w:trPr>
+        <w:tc>
+          <w:tcPr>
+            <w:tcW w:type="dxa" w:w="8666"/>
+            <w:tcBorders>
+              <w:top w:val="single" w:color="7F8A99" w:sz="4"/>
+              <w:left w:val="single" w:color="7F8A99" w:sz="4"/>
+              <w:bottom w:val="single" w:color="7F8A99" w:sz="4"/>
+              <w:right w:val="single" w:color="7F8A99" w:sz="4"/>
+            </w:tcBorders>
+            <w:shd w:fill="F3F5F8" w:color="auto" w:val="clear"/>
+            <w:tcMar>
+              <w:top w:type="dxa" w:w="80"/>
+              <w:left w:type="dxa" w:w="140"/>
+              <w:bottom w:type="dxa" w:w="80"/>
+              <w:right w:type="dxa" w:w="140"/>
+            </w:tcMar>
+          </w:tcPr>
+          <w:p>
+            <w:pPr>
+              <w:spacing w:after="0" w:line="228"/>
+            </w:pPr>
+            <w:r>
+              <w:rPr>
+                <w:rFonts w:ascii="Consolas" w:cs="Consolas" w:eastAsia="Consolas" w:hAnsi="Consolas"/>
+                <w:sz w:val="17"/>
+                <w:szCs w:val="17"/>
+              </w:rPr>
+              <w:t xml:space="preserve"># 1-2. clone and install</w:t>
+            </w:r>
+          </w:p>
+          <w:p>
+            <w:pPr>
+              <w:spacing w:after="0" w:line="228"/>
+            </w:pPr>
+            <w:r>
+              <w:rPr>
+                <w:rFonts w:ascii="Consolas" w:cs="Consolas" w:eastAsia="Consolas" w:hAnsi="Consolas"/>
+                <w:sz w:val="17"/>
+                <w:szCs w:val="17"/>
+              </w:rPr>
+              <w:t xml:space="preserve">git clone https://github.com/reyhaan07/E-Commerce.git</w:t>
+            </w:r>
+          </w:p>
+          <w:p>
+            <w:pPr>
+              <w:spacing w:after="0" w:line="228"/>
+            </w:pPr>
+            <w:r>
+              <w:rPr>
+                <w:rFonts w:ascii="Consolas" w:cs="Consolas" w:eastAsia="Consolas" w:hAnsi="Consolas"/>
+                <w:sz w:val="17"/>
+                <w:szCs w:val="17"/>
+              </w:rPr>
+              <w:t xml:space="preserve">cd E-Commerce</w:t>
+            </w:r>
+          </w:p>
+          <w:p>
+            <w:pPr>
+              <w:spacing w:after="0" w:line="228"/>
+            </w:pPr>
+            <w:r>
+              <w:rPr>
+                <w:rFonts w:ascii="Consolas" w:cs="Consolas" w:eastAsia="Consolas" w:hAnsi="Consolas"/>
+                <w:sz w:val="17"/>
+                <w:szCs w:val="17"/>
+              </w:rPr>
+              <w:t xml:space="preserve">npm install</w:t>
+            </w:r>
+          </w:p>
+          <w:p>
+            <w:pPr>
+              <w:spacing w:after="0" w:line="228"/>
+            </w:pPr>
+            <w:r>
+              <w:rPr>
+                <w:rFonts w:ascii="Consolas" w:cs="Consolas" w:eastAsia="Consolas" w:hAnsi="Consolas"/>
+                <w:sz w:val="17"/>
+                <w:szCs w:val="17"/>
+              </w:rPr>
+              <w:t xml:space="preserve">npm run install:all</w:t>
+            </w:r>
+          </w:p>
+          <w:p>
+            <w:pPr>
+              <w:spacing w:after="0" w:line="228"/>
+            </w:pPr>
+            <w:r>
+              <w:rPr>
+                <w:rFonts w:ascii="Consolas" w:cs="Consolas" w:eastAsia="Consolas" w:hAnsi="Consolas"/>
+                <w:sz w:val="17"/>
+                <w:szCs w:val="17"/>
+              </w:rPr>
+              <w:t xml:space="preserve"> </w:t>
+            </w:r>
+          </w:p>
+          <w:p>
+            <w:pPr>
+              <w:spacing w:after="0" w:line="228"/>
+            </w:pPr>
+            <w:r>
+              <w:rPr>
+                <w:rFonts w:ascii="Consolas" w:cs="Consolas" w:eastAsia="Consolas" w:hAnsi="Consolas"/>
+                <w:sz w:val="17"/>
+                <w:szCs w:val="17"/>
+              </w:rPr>
+              <w:t xml:space="preserve"># 3. configure the backend</w:t>
+            </w:r>
+          </w:p>
+          <w:p>
+            <w:pPr>
+              <w:spacing w:after="0" w:line="228"/>
+            </w:pPr>
+            <w:r>
+              <w:rPr>
+                <w:rFonts w:ascii="Consolas" w:cs="Consolas" w:eastAsia="Consolas" w:hAnsi="Consolas"/>
+                <w:sz w:val="17"/>
+                <w:szCs w:val="17"/>
+              </w:rPr>
+              <w:t xml:space="preserve">cp backend/.env.example backend/.env      # then edit MONGO_URI and JWT_SECRET</w:t>
+            </w:r>
+          </w:p>
+          <w:p>
+            <w:pPr>
+              <w:spacing w:after="0" w:line="228"/>
+            </w:pPr>
+            <w:r>
+              <w:rPr>
+                <w:rFonts w:ascii="Consolas" w:cs="Consolas" w:eastAsia="Consolas" w:hAnsi="Consolas"/>
+                <w:sz w:val="17"/>
+                <w:szCs w:val="17"/>
+              </w:rPr>
+              <w:t xml:space="preserve"> </w:t>
+            </w:r>
+          </w:p>
+          <w:p>
+            <w:pPr>
+              <w:spacing w:after="0" w:line="228"/>
+            </w:pPr>
+            <w:r>
+              <w:rPr>
+                <w:rFonts w:ascii="Consolas" w:cs="Consolas" w:eastAsia="Consolas" w:hAnsi="Consolas"/>
+                <w:sz w:val="17"/>
+                <w:szCs w:val="17"/>
+              </w:rPr>
+              <w:t xml:space="preserve"># 4. start the API (5000) and all five portals (5173-5177)</w:t>
+            </w:r>
+          </w:p>
+          <w:p>
+            <w:pPr>
+              <w:spacing w:after="0" w:line="228"/>
+            </w:pPr>
+            <w:r>
+              <w:rPr>
+                <w:rFonts w:ascii="Consolas" w:cs="Consolas" w:eastAsia="Consolas" w:hAnsi="Consolas"/>
+                <w:sz w:val="17"/>
+                <w:szCs w:val="17"/>
+              </w:rPr>
+              <w:t xml:space="preserve">npm run dev</w:t>
+            </w:r>
+          </w:p>
+          <w:p>
+            <w:pPr>
+              <w:spacing w:after="0" w:line="228"/>
+            </w:pPr>
+            <w:r>
+              <w:rPr>
+                <w:rFonts w:ascii="Consolas" w:cs="Consolas" w:eastAsia="Consolas" w:hAnsi="Consolas"/>
+                <w:sz w:val="17"/>
+                <w:szCs w:val="17"/>
+              </w:rPr>
+              <w:t xml:space="preserve"> </w:t>
+            </w:r>
+          </w:p>
+          <w:p>
+            <w:pPr>
+              <w:spacing w:after="0" w:line="228"/>
+            </w:pPr>
+            <w:r>
+              <w:rPr>
+                <w:rFonts w:ascii="Consolas" w:cs="Consolas" w:eastAsia="Consolas" w:hAnsi="Consolas"/>
+                <w:sz w:val="17"/>
+                <w:szCs w:val="17"/>
+              </w:rPr>
+              <w:t xml:space="preserve"># useful extras</w:t>
+            </w:r>
+          </w:p>
+          <w:p>
+            <w:pPr>
+              <w:spacing w:after="0" w:line="228"/>
+            </w:pPr>
+            <w:r>
+              <w:rPr>
+                <w:rFonts w:ascii="Consolas" w:cs="Consolas" w:eastAsia="Consolas" w:hAnsi="Consolas"/>
+                <w:sz w:val="17"/>
+                <w:szCs w:val="17"/>
+              </w:rPr>
+              <w:t xml:space="preserve">npm run reseed --prefix backend           # drop and re-seed the demo data</w:t>
+            </w:r>
+          </w:p>
+          <w:p>
+            <w:pPr>
+              <w:spacing w:after="0" w:line="228"/>
+            </w:pPr>
+            <w:r>
+              <w:rPr>
+                <w:rFonts w:ascii="Consolas" w:cs="Consolas" w:eastAsia="Consolas" w:hAnsi="Consolas"/>
+                <w:sz w:val="17"/>
+                <w:szCs w:val="17"/>
+              </w:rPr>
+              <w:t xml:space="preserve">npm test --prefix backend                 # smoke test (backend must be running)</w:t>
+            </w:r>
+          </w:p>
+          <w:p>
+            <w:pPr>
+              <w:spacing w:after="0" w:line="228"/>
+            </w:pPr>
+            <w:r>
+              <w:rPr>
+                <w:rFonts w:ascii="Consolas" w:cs="Consolas" w:eastAsia="Consolas" w:hAnsi="Consolas"/>
+                <w:sz w:val="17"/>
+                <w:szCs w:val="17"/>
+              </w:rPr>
+              <w:t xml:space="preserve">npm run build:all                         # production builds of all portals</w:t>
+            </w:r>
+          </w:p>
+        </w:tc>
+      </w:tr>
+    </w:tbl>
+    <w:p>
+      <w:pPr>
+        <w:spacing w:after="100"/>
+      </w:pPr>
+    </w:p>
+    <w:p>
+      <w:pPr>
+        <w:keepNext/>
+        <w:spacing w:after="180" w:before="60"/>
+        <w:jc w:val="center"/>
+      </w:pPr>
+      <w:r>
+        <w:rPr>
+          <w:b/>
+          <w:bCs/>
+          <w:sz w:val="21"/>
+          <w:szCs w:val="21"/>
+        </w:rPr>
+        <w:t xml:space="preserve">Table B.1: </w:t>
+      </w:r>
+      <w:r>
+        <w:rPr>
+          <w:sz w:val="21"/>
+          <w:szCs w:val="21"/>
+        </w:rPr>
+        <w:t xml:space="preserve">Applications and their local addresses</w:t>
+      </w:r>
+    </w:p>
+    <w:tbl>
+      <w:tblPr>
+        <w:tblW w:type="dxa" w:w="8666"/>
+        <w:jc w:val="center"/>
+        <w:tblBorders>
+          <w:top w:val="single" w:color="auto" w:sz="4"/>
+          <w:left w:val="single" w:color="auto" w:sz="4"/>
+          <w:bottom w:val="single" w:color="auto" w:sz="4"/>
+          <w:right w:val="single" w:color="auto" w:sz="4"/>
+          <w:insideH w:val="single" w:color="auto" w:sz="4"/>
+          <w:insideV w:val="single" w:color="auto" w:sz="4"/>
+        </w:tblBorders>
+      </w:tblPr>
+      <w:tblGrid>
+        <w:gridCol w:w="3200"/>
+        <w:gridCol w:w="2600"/>
+        <w:gridCol w:w="2866"/>
+      </w:tblGrid>
+      <w:tr>
+        <w:trPr>
+          <w:cantSplit/>
+          <w:tblHeader/>
+        </w:trPr>
+        <w:tc>
+          <w:tcPr>
+            <w:tcW w:type="dxa" w:w="3200"/>
+            <w:tcBorders>
+              <w:top w:val="single" w:color="7F8A99" w:sz="4"/>
+              <w:left w:val="single" w:color="7F8A99" w:sz="4"/>
+              <w:bottom w:val="single" w:color="7F8A99" w:sz="4"/>
+              <w:right w:val="single" w:color="7F8A99" w:sz="4"/>
+            </w:tcBorders>
+            <w:shd w:fill="DCE6F2" w:color="auto" w:val="clear"/>
+            <w:tcMar>
+              <w:top w:type="dxa" w:w="40"/>
+              <w:left w:type="dxa" w:w="80"/>
+              <w:bottom w:type="dxa" w:w="40"/>
+              <w:right w:type="dxa" w:w="80"/>
+            </w:tcMar>
+            <w:vAlign w:val="center"/>
+          </w:tcPr>
+          <w:p>
+            <w:pPr>
+              <w:spacing w:after="0" w:line="252"/>
+              <w:jc w:val="center"/>
+            </w:pPr>
+            <w:r>
+              <w:rPr>
+                <w:b/>
+                <w:bCs/>
+                <w:sz w:val="19"/>
+                <w:szCs w:val="19"/>
+              </w:rPr>
+              <w:t xml:space="preserve">Application</w:t>
+            </w:r>
+          </w:p>
+        </w:tc>
+        <w:tc>
+          <w:tcPr>
+            <w:tcW w:type="dxa" w:w="2600"/>
+            <w:tcBorders>
+              <w:top w:val="single" w:color="7F8A99" w:sz="4"/>
+              <w:left w:val="single" w:color="7F8A99" w:sz="4"/>
+              <w:bottom w:val="single" w:color="7F8A99" w:sz="4"/>
+              <w:right w:val="single" w:color="7F8A99" w:sz="4"/>
+            </w:tcBorders>
+            <w:shd w:fill="DCE6F2" w:color="auto" w:val="clear"/>
+            <w:tcMar>
+              <w:top w:type="dxa" w:w="40"/>
+              <w:left w:type="dxa" w:w="80"/>
+              <w:bottom w:type="dxa" w:w="40"/>
+              <w:right w:type="dxa" w:w="80"/>
+            </w:tcMar>
+            <w:vAlign w:val="center"/>
+          </w:tcPr>
+          <w:p>
+            <w:pPr>
+              <w:spacing w:after="0" w:line="252"/>
+              <w:jc w:val="center"/>
+            </w:pPr>
+            <w:r>
+              <w:rPr>
+                <w:b/>
+                <w:bCs/>
+                <w:sz w:val="19"/>
+                <w:szCs w:val="19"/>
+              </w:rPr>
+              <w:t xml:space="preserve">Folder</w:t>
+            </w:r>
+          </w:p>
+        </w:tc>
+        <w:tc>
+          <w:tcPr>
+            <w:tcW w:type="dxa" w:w="2866"/>
+            <w:tcBorders>
+              <w:top w:val="single" w:color="7F8A99" w:sz="4"/>
+              <w:left w:val="single" w:color="7F8A99" w:sz="4"/>
+              <w:bottom w:val="single" w:color="7F8A99" w:sz="4"/>
+              <w:right w:val="single" w:color="7F8A99" w:sz="4"/>
+            </w:tcBorders>
+            <w:shd w:fill="DCE6F2" w:color="auto" w:val="clear"/>
+            <w:tcMar>
+              <w:top w:type="dxa" w:w="40"/>
+              <w:left w:type="dxa" w:w="80"/>
+              <w:bottom w:type="dxa" w:w="40"/>
+              <w:right w:type="dxa" w:w="80"/>
+            </w:tcMar>
+            <w:vAlign w:val="center"/>
+          </w:tcPr>
+          <w:p>
+            <w:pPr>
+              <w:spacing w:after="0" w:line="252"/>
+              <w:jc w:val="center"/>
+            </w:pPr>
+            <w:r>
+              <w:rPr>
+                <w:b/>
+                <w:bCs/>
+                <w:sz w:val="19"/>
+                <w:szCs w:val="19"/>
+              </w:rPr>
+              <w:t xml:space="preserve">Address</w:t>
+            </w:r>
+          </w:p>
+        </w:tc>
+      </w:tr>
+      <w:tr>
+        <w:trPr>
+          <w:cantSplit/>
+        </w:trPr>
+        <w:tc>
+          <w:tcPr>
+            <w:tcW w:type="dxa" w:w="3200"/>
+            <w:tcBorders>
+              <w:top w:val="single" w:color="7F8A99" w:sz="4"/>
+              <w:left w:val="single" w:color="7F8A99" w:sz="4"/>
+              <w:bottom w:val="single" w:color="7F8A99" w:sz="4"/>
+              <w:right w:val="single" w:color="7F8A99" w:sz="4"/>
+            </w:tcBorders>
+            <w:tcMar>
+              <w:top w:type="dxa" w:w="40"/>
+              <w:left w:type="dxa" w:w="80"/>
+              <w:bottom w:type="dxa" w:w="40"/>
+              <w:right w:type="dxa" w:w="80"/>
+            </w:tcMar>
+            <w:vAlign w:val="center"/>
+          </w:tcPr>
+          <w:p>
+            <w:pPr>
+              <w:spacing w:after="0" w:line="252"/>
+              <w:jc w:val="left"/>
+            </w:pPr>
+            <w:r>
+              <w:rPr>
+                <w:sz w:val="19"/>
+                <w:szCs w:val="19"/>
+              </w:rPr>
+              <w:t xml:space="preserve">Backend API and Socket.io</w:t>
+            </w:r>
+          </w:p>
+        </w:tc>
+        <w:tc>
+          <w:tcPr>
+            <w:tcW w:type="dxa" w:w="2600"/>
+            <w:tcBorders>
+              <w:top w:val="single" w:color="7F8A99" w:sz="4"/>
+              <w:left w:val="single" w:color="7F8A99" w:sz="4"/>
+              <w:bottom w:val="single" w:color="7F8A99" w:sz="4"/>
+              <w:right w:val="single" w:color="7F8A99" w:sz="4"/>
+            </w:tcBorders>
+            <w:tcMar>
+              <w:top w:type="dxa" w:w="40"/>
+              <w:left w:type="dxa" w:w="80"/>
+              <w:bottom w:type="dxa" w:w="40"/>
+              <w:right w:type="dxa" w:w="80"/>
+            </w:tcMar>
+            <w:vAlign w:val="center"/>
+          </w:tcPr>
+          <w:p>
+            <w:pPr>
+              <w:spacing w:after="0" w:line="252"/>
+              <w:jc w:val="left"/>
+            </w:pPr>
+            <w:r>
+              <w:rPr>
+                <w:sz w:val="19"/>
+                <w:szCs w:val="19"/>
+              </w:rPr>
+              <w:t xml:space="preserve">backend/</w:t>
+            </w:r>
+          </w:p>
+        </w:tc>
+        <w:tc>
+          <w:tcPr>
+            <w:tcW w:type="dxa" w:w="2866"/>
+            <w:tcBorders>
+              <w:top w:val="single" w:color="7F8A99" w:sz="4"/>
+              <w:left w:val="single" w:color="7F8A99" w:sz="4"/>
+              <w:bottom w:val="single" w:color="7F8A99" w:sz="4"/>
+              <w:right w:val="single" w:color="7F8A99" w:sz="4"/>
+            </w:tcBorders>
+            <w:tcMar>
+              <w:top w:type="dxa" w:w="40"/>
+              <w:left w:type="dxa" w:w="80"/>
+              <w:bottom w:type="dxa" w:w="40"/>
+              <w:right w:type="dxa" w:w="80"/>
+            </w:tcMar>
+            <w:vAlign w:val="center"/>
+          </w:tcPr>
+          <w:p>
+            <w:pPr>
+              <w:spacing w:after="0" w:line="252"/>
+              <w:jc w:val="left"/>
+            </w:pPr>
+            <w:r>
+              <w:rPr>
+                <w:sz w:val="19"/>
+                <w:szCs w:val="19"/>
+              </w:rPr>
+              <w:t xml:space="preserve">http://localhost:5000</w:t>
+            </w:r>
+          </w:p>
+        </w:tc>
+      </w:tr>
+      <w:tr>
+        <w:trPr>
+          <w:cantSplit/>
+        </w:trPr>
+        <w:tc>
+          <w:tcPr>
+            <w:tcW w:type="dxa" w:w="3200"/>
+            <w:tcBorders>
+              <w:top w:val="single" w:color="7F8A99" w:sz="4"/>
+              <w:left w:val="single" w:color="7F8A99" w:sz="4"/>
+              <w:bottom w:val="single" w:color="7F8A99" w:sz="4"/>
+              <w:right w:val="single" w:color="7F8A99" w:sz="4"/>
+            </w:tcBorders>
+            <w:tcMar>
+              <w:top w:type="dxa" w:w="40"/>
+              <w:left w:type="dxa" w:w="80"/>
+              <w:bottom w:type="dxa" w:w="40"/>
+              <w:right w:type="dxa" w:w="80"/>
+            </w:tcMar>
+            <w:vAlign w:val="center"/>
+          </w:tcPr>
+          <w:p>
+            <w:pPr>
+              <w:spacing w:after="0" w:line="252"/>
+              <w:jc w:val="left"/>
+            </w:pPr>
+            <w:r>
+              <w:rPr>
+                <w:sz w:val="19"/>
+                <w:szCs w:val="19"/>
+              </w:rPr>
+              <w:t xml:space="preserve">Admin console</w:t>
+            </w:r>
+          </w:p>
+        </w:tc>
+        <w:tc>
+          <w:tcPr>
+            <w:tcW w:type="dxa" w:w="2600"/>
+            <w:tcBorders>
+              <w:top w:val="single" w:color="7F8A99" w:sz="4"/>
+              <w:left w:val="single" w:color="7F8A99" w:sz="4"/>
+              <w:bottom w:val="single" w:color="7F8A99" w:sz="4"/>
+              <w:right w:val="single" w:color="7F8A99" w:sz="4"/>
+            </w:tcBorders>
+            <w:tcMar>
+              <w:top w:type="dxa" w:w="40"/>
+              <w:left w:type="dxa" w:w="80"/>
+              <w:bottom w:type="dxa" w:w="40"/>
+              <w:right w:type="dxa" w:w="80"/>
+            </w:tcMar>
+            <w:vAlign w:val="center"/>
+          </w:tcPr>
+          <w:p>
+            <w:pPr>
+              <w:spacing w:after="0" w:line="252"/>
+              <w:jc w:val="left"/>
+            </w:pPr>
+            <w:r>
+              <w:rPr>
+                <w:sz w:val="19"/>
+                <w:szCs w:val="19"/>
+              </w:rPr>
+              <w:t xml:space="preserve">frontend/admin/</w:t>
+            </w:r>
+          </w:p>
+        </w:tc>
+        <w:tc>
+          <w:tcPr>
+            <w:tcW w:type="dxa" w:w="2866"/>
+            <w:tcBorders>
+              <w:top w:val="single" w:color="7F8A99" w:sz="4"/>
+              <w:left w:val="single" w:color="7F8A99" w:sz="4"/>
+              <w:bottom w:val="single" w:color="7F8A99" w:sz="4"/>
+              <w:right w:val="single" w:color="7F8A99" w:sz="4"/>
+            </w:tcBorders>
+            <w:tcMar>
+              <w:top w:type="dxa" w:w="40"/>
+              <w:left w:type="dxa" w:w="80"/>
+              <w:bottom w:type="dxa" w:w="40"/>
+              <w:right w:type="dxa" w:w="80"/>
+            </w:tcMar>
+            <w:vAlign w:val="center"/>
+          </w:tcPr>
+          <w:p>
+            <w:pPr>
+              <w:spacing w:after="0" w:line="252"/>
+              <w:jc w:val="left"/>
+            </w:pPr>
+            <w:r>
+              <w:rPr>
+                <w:sz w:val="19"/>
+                <w:szCs w:val="19"/>
+              </w:rPr>
+              <w:t xml:space="preserve">http://localhost:5173</w:t>
+            </w:r>
+          </w:p>
+        </w:tc>
+      </w:tr>
+      <w:tr>
+        <w:trPr>
+          <w:cantSplit/>
+        </w:trPr>
+        <w:tc>
+          <w:tcPr>
+            <w:tcW w:type="dxa" w:w="3200"/>
+            <w:tcBorders>
+              <w:top w:val="single" w:color="7F8A99" w:sz="4"/>
+              <w:left w:val="single" w:color="7F8A99" w:sz="4"/>
+              <w:bottom w:val="single" w:color="7F8A99" w:sz="4"/>
+              <w:right w:val="single" w:color="7F8A99" w:sz="4"/>
+            </w:tcBorders>
+            <w:tcMar>
+              <w:top w:type="dxa" w:w="40"/>
+              <w:left w:type="dxa" w:w="80"/>
+              <w:bottom w:type="dxa" w:w="40"/>
+              <w:right w:type="dxa" w:w="80"/>
+            </w:tcMar>
+            <w:vAlign w:val="center"/>
+          </w:tcPr>
+          <w:p>
+            <w:pPr>
+              <w:spacing w:after="0" w:line="252"/>
+              <w:jc w:val="left"/>
+            </w:pPr>
+            <w:r>
+              <w:rPr>
+                <w:sz w:val="19"/>
+                <w:szCs w:val="19"/>
+              </w:rPr>
+              <w:t xml:space="preserve">Seller portal</w:t>
+            </w:r>
+          </w:p>
+        </w:tc>
+        <w:tc>
+          <w:tcPr>
+            <w:tcW w:type="dxa" w:w="2600"/>
+            <w:tcBorders>
+              <w:top w:val="single" w:color="7F8A99" w:sz="4"/>
+              <w:left w:val="single" w:color="7F8A99" w:sz="4"/>
+              <w:bottom w:val="single" w:color="7F8A99" w:sz="4"/>
+              <w:right w:val="single" w:color="7F8A99" w:sz="4"/>
+            </w:tcBorders>
+            <w:tcMar>
+              <w:top w:type="dxa" w:w="40"/>
+              <w:left w:type="dxa" w:w="80"/>
+              <w:bottom w:type="dxa" w:w="40"/>
+              <w:right w:type="dxa" w:w="80"/>
+            </w:tcMar>
+            <w:vAlign w:val="center"/>
+          </w:tcPr>
+          <w:p>
+            <w:pPr>
+              <w:spacing w:after="0" w:line="252"/>
+              <w:jc w:val="left"/>
+            </w:pPr>
+            <w:r>
+              <w:rPr>
+                <w:sz w:val="19"/>
+                <w:szCs w:val="19"/>
+              </w:rPr>
+              <w:t xml:space="preserve">frontend/seller/</w:t>
+            </w:r>
+          </w:p>
+        </w:tc>
+        <w:tc>
+          <w:tcPr>
+            <w:tcW w:type="dxa" w:w="2866"/>
+            <w:tcBorders>
+              <w:top w:val="single" w:color="7F8A99" w:sz="4"/>
+              <w:left w:val="single" w:color="7F8A99" w:sz="4"/>
+              <w:bottom w:val="single" w:color="7F8A99" w:sz="4"/>
+              <w:right w:val="single" w:color="7F8A99" w:sz="4"/>
+            </w:tcBorders>
+            <w:tcMar>
+              <w:top w:type="dxa" w:w="40"/>
+              <w:left w:type="dxa" w:w="80"/>
+              <w:bottom w:type="dxa" w:w="40"/>
+              <w:right w:type="dxa" w:w="80"/>
+            </w:tcMar>
+            <w:vAlign w:val="center"/>
+          </w:tcPr>
+          <w:p>
+            <w:pPr>
+              <w:spacing w:after="0" w:line="252"/>
+              <w:jc w:val="left"/>
+            </w:pPr>
+            <w:r>
+              <w:rPr>
+                <w:sz w:val="19"/>
+                <w:szCs w:val="19"/>
+              </w:rPr>
+              <w:t xml:space="preserve">http://localhost:5174</w:t>
+            </w:r>
+          </w:p>
+        </w:tc>
+      </w:tr>
+      <w:tr>
+        <w:trPr>
+          <w:cantSplit/>
+        </w:trPr>
+        <w:tc>
+          <w:tcPr>
+            <w:tcW w:type="dxa" w:w="3200"/>
+            <w:tcBorders>
+              <w:top w:val="single" w:color="7F8A99" w:sz="4"/>
+              <w:left w:val="single" w:color="7F8A99" w:sz="4"/>
+              <w:bottom w:val="single" w:color="7F8A99" w:sz="4"/>
+              <w:right w:val="single" w:color="7F8A99" w:sz="4"/>
+            </w:tcBorders>
+            <w:tcMar>
+              <w:top w:type="dxa" w:w="40"/>
+              <w:left w:type="dxa" w:w="80"/>
+              <w:bottom w:type="dxa" w:w="40"/>
+              <w:right w:type="dxa" w:w="80"/>
+            </w:tcMar>
+            <w:vAlign w:val="center"/>
+          </w:tcPr>
+          <w:p>
+            <w:pPr>
+              <w:spacing w:after="0" w:line="252"/>
+              <w:jc w:val="left"/>
+            </w:pPr>
+            <w:r>
+              <w:rPr>
+                <w:sz w:val="19"/>
+                <w:szCs w:val="19"/>
+              </w:rPr>
+              <w:t xml:space="preserve">Customer storefront</w:t>
+            </w:r>
+          </w:p>
+        </w:tc>
+        <w:tc>
+          <w:tcPr>
+            <w:tcW w:type="dxa" w:w="2600"/>
+            <w:tcBorders>
+              <w:top w:val="single" w:color="7F8A99" w:sz="4"/>
+              <w:left w:val="single" w:color="7F8A99" w:sz="4"/>
+              <w:bottom w:val="single" w:color="7F8A99" w:sz="4"/>
+              <w:right w:val="single" w:color="7F8A99" w:sz="4"/>
+            </w:tcBorders>
+            <w:tcMar>
+              <w:top w:type="dxa" w:w="40"/>
+              <w:left w:type="dxa" w:w="80"/>
+              <w:bottom w:type="dxa" w:w="40"/>
+              <w:right w:type="dxa" w:w="80"/>
+            </w:tcMar>
+            <w:vAlign w:val="center"/>
+          </w:tcPr>
+          <w:p>
+            <w:pPr>
+              <w:spacing w:after="0" w:line="252"/>
+              <w:jc w:val="left"/>
+            </w:pPr>
+            <w:r>
+              <w:rPr>
+                <w:sz w:val="19"/>
+                <w:szCs w:val="19"/>
+              </w:rPr>
+              <w:t xml:space="preserve">frontend/user/</w:t>
+            </w:r>
+          </w:p>
+        </w:tc>
+        <w:tc>
+          <w:tcPr>
+            <w:tcW w:type="dxa" w:w="2866"/>
+            <w:tcBorders>
+              <w:top w:val="single" w:color="7F8A99" w:sz="4"/>
+              <w:left w:val="single" w:color="7F8A99" w:sz="4"/>
+              <w:bottom w:val="single" w:color="7F8A99" w:sz="4"/>
+              <w:right w:val="single" w:color="7F8A99" w:sz="4"/>
+            </w:tcBorders>
+            <w:tcMar>
+              <w:top w:type="dxa" w:w="40"/>
+              <w:left w:type="dxa" w:w="80"/>
+              <w:bottom w:type="dxa" w:w="40"/>
+              <w:right w:type="dxa" w:w="80"/>
+            </w:tcMar>
+            <w:vAlign w:val="center"/>
+          </w:tcPr>
+          <w:p>
+            <w:pPr>
+              <w:spacing w:after="0" w:line="252"/>
+              <w:jc w:val="left"/>
+            </w:pPr>
+            <w:r>
+              <w:rPr>
+                <w:sz w:val="19"/>
+                <w:szCs w:val="19"/>
+              </w:rPr>
+              <w:t xml:space="preserve">http://localhost:5175</w:t>
+            </w:r>
+          </w:p>
+        </w:tc>
+      </w:tr>
+      <w:tr>
+        <w:trPr>
+          <w:cantSplit/>
+        </w:trPr>
+        <w:tc>
+          <w:tcPr>
+            <w:tcW w:type="dxa" w:w="3200"/>
+            <w:tcBorders>
+              <w:top w:val="single" w:color="7F8A99" w:sz="4"/>
+              <w:left w:val="single" w:color="7F8A99" w:sz="4"/>
+              <w:bottom w:val="single" w:color="7F8A99" w:sz="4"/>
+              <w:right w:val="single" w:color="7F8A99" w:sz="4"/>
+            </w:tcBorders>
+            <w:tcMar>
+              <w:top w:type="dxa" w:w="40"/>
+              <w:left w:type="dxa" w:w="80"/>
+              <w:bottom w:type="dxa" w:w="40"/>
+              <w:right w:type="dxa" w:w="80"/>
+            </w:tcMar>
+            <w:vAlign w:val="center"/>
+          </w:tcPr>
+          <w:p>
+            <w:pPr>
+              <w:spacing w:after="0" w:line="252"/>
+              <w:jc w:val="left"/>
+            </w:pPr>
+            <w:r>
+              <w:rPr>
+                <w:sz w:val="19"/>
+                <w:szCs w:val="19"/>
+              </w:rPr>
+              <w:t xml:space="preserve">Delivery partner console</w:t>
+            </w:r>
+          </w:p>
+        </w:tc>
+        <w:tc>
+          <w:tcPr>
+            <w:tcW w:type="dxa" w:w="2600"/>
+            <w:tcBorders>
+              <w:top w:val="single" w:color="7F8A99" w:sz="4"/>
+              <w:left w:val="single" w:color="7F8A99" w:sz="4"/>
+              <w:bottom w:val="single" w:color="7F8A99" w:sz="4"/>
+              <w:right w:val="single" w:color="7F8A99" w:sz="4"/>
+            </w:tcBorders>
+            <w:tcMar>
+              <w:top w:type="dxa" w:w="40"/>
+              <w:left w:type="dxa" w:w="80"/>
+              <w:bottom w:type="dxa" w:w="40"/>
+              <w:right w:type="dxa" w:w="80"/>
+            </w:tcMar>
+            <w:vAlign w:val="center"/>
+          </w:tcPr>
+          <w:p>
+            <w:pPr>
+              <w:spacing w:after="0" w:line="252"/>
+              <w:jc w:val="left"/>
+            </w:pPr>
+            <w:r>
+              <w:rPr>
+                <w:sz w:val="19"/>
+                <w:szCs w:val="19"/>
+              </w:rPr>
+              <w:t xml:space="preserve">frontend/delivery/</w:t>
+            </w:r>
+          </w:p>
+        </w:tc>
+        <w:tc>
+          <w:tcPr>
+            <w:tcW w:type="dxa" w:w="2866"/>
+            <w:tcBorders>
+              <w:top w:val="single" w:color="7F8A99" w:sz="4"/>
+              <w:left w:val="single" w:color="7F8A99" w:sz="4"/>
+              <w:bottom w:val="single" w:color="7F8A99" w:sz="4"/>
+              <w:right w:val="single" w:color="7F8A99" w:sz="4"/>
+            </w:tcBorders>
+            <w:tcMar>
+              <w:top w:type="dxa" w:w="40"/>
+              <w:left w:type="dxa" w:w="80"/>
+              <w:bottom w:type="dxa" w:w="40"/>
+              <w:right w:type="dxa" w:w="80"/>
+            </w:tcMar>
+            <w:vAlign w:val="center"/>
+          </w:tcPr>
+          <w:p>
+            <w:pPr>
+              <w:spacing w:after="0" w:line="252"/>
+              <w:jc w:val="left"/>
+            </w:pPr>
+            <w:r>
+              <w:rPr>
+                <w:sz w:val="19"/>
+                <w:szCs w:val="19"/>
+              </w:rPr>
+              <w:t xml:space="preserve">http://localhost:5176</w:t>
+            </w:r>
+          </w:p>
+        </w:tc>
+      </w:tr>
+      <w:tr>
+        <w:trPr>
+          <w:cantSplit/>
+        </w:trPr>
+        <w:tc>
+          <w:tcPr>
+            <w:tcW w:type="dxa" w:w="3200"/>
+            <w:tcBorders>
+              <w:top w:val="single" w:color="7F8A99" w:sz="4"/>
+              <w:left w:val="single" w:color="7F8A99" w:sz="4"/>
+              <w:bottom w:val="single" w:color="7F8A99" w:sz="4"/>
+              <w:right w:val="single" w:color="7F8A99" w:sz="4"/>
+            </w:tcBorders>
+            <w:tcMar>
+              <w:top w:type="dxa" w:w="40"/>
+              <w:left w:type="dxa" w:w="80"/>
+              <w:bottom w:type="dxa" w:w="40"/>
+              <w:right w:type="dxa" w:w="80"/>
+            </w:tcMar>
+            <w:vAlign w:val="center"/>
+          </w:tcPr>
+          <w:p>
+            <w:pPr>
+              <w:spacing w:after="0" w:line="252"/>
+              <w:jc w:val="left"/>
+            </w:pPr>
+            <w:r>
+              <w:rPr>
+                <w:sz w:val="19"/>
+                <w:szCs w:val="19"/>
+              </w:rPr>
+              <w:t xml:space="preserve">Shared login</w:t>
+            </w:r>
+          </w:p>
+        </w:tc>
+        <w:tc>
+          <w:tcPr>
+            <w:tcW w:type="dxa" w:w="2600"/>
+            <w:tcBorders>
+              <w:top w:val="single" w:color="7F8A99" w:sz="4"/>
+              <w:left w:val="single" w:color="7F8A99" w:sz="4"/>
+              <w:bottom w:val="single" w:color="7F8A99" w:sz="4"/>
+              <w:right w:val="single" w:color="7F8A99" w:sz="4"/>
+            </w:tcBorders>
+            <w:tcMar>
+              <w:top w:type="dxa" w:w="40"/>
+              <w:left w:type="dxa" w:w="80"/>
+              <w:bottom w:type="dxa" w:w="40"/>
+              <w:right w:type="dxa" w:w="80"/>
+            </w:tcMar>
+            <w:vAlign w:val="center"/>
+          </w:tcPr>
+          <w:p>
+            <w:pPr>
+              <w:spacing w:after="0" w:line="252"/>
+              <w:jc w:val="left"/>
+            </w:pPr>
+            <w:r>
+              <w:rPr>
+                <w:sz w:val="19"/>
+                <w:szCs w:val="19"/>
+              </w:rPr>
+              <w:t xml:space="preserve">frontend/login/</w:t>
+            </w:r>
+          </w:p>
+        </w:tc>
+        <w:tc>
+          <w:tcPr>
+            <w:tcW w:type="dxa" w:w="2866"/>
+            <w:tcBorders>
+              <w:top w:val="single" w:color="7F8A99" w:sz="4"/>
+              <w:left w:val="single" w:color="7F8A99" w:sz="4"/>
+              <w:bottom w:val="single" w:color="7F8A99" w:sz="4"/>
+              <w:right w:val="single" w:color="7F8A99" w:sz="4"/>
+            </w:tcBorders>
+            <w:tcMar>
+              <w:top w:type="dxa" w:w="40"/>
+              <w:left w:type="dxa" w:w="80"/>
+              <w:bottom w:type="dxa" w:w="40"/>
+              <w:right w:type="dxa" w:w="80"/>
+            </w:tcMar>
+            <w:vAlign w:val="center"/>
+          </w:tcPr>
+          <w:p>
+            <w:pPr>
+              <w:spacing w:after="0" w:line="252"/>
+              <w:jc w:val="left"/>
+            </w:pPr>
+            <w:r>
+              <w:rPr>
+                <w:sz w:val="19"/>
+                <w:szCs w:val="19"/>
+              </w:rPr>
+              <w:t xml:space="preserve">http://localhost:5177</w:t>
             </w:r>
           </w:p>
         </w:tc>
@@ -32340,6 +33586,18 @@
       </w:pPr>
     </w:lvl>
   </w:abstractNum>
+  <w:abstractNum w:abstractNumId="4" w15:restartNumberingAfterBreak="0">
+    <w:multiLevelType w:val="hybridMultilevel"/>
+    <w:lvl w:ilvl="0" w15:tentative="1">
+      <w:start w:val="1"/>
+      <w:numFmt w:val="decimal"/>
+      <w:lvlText w:val="%1."/>
+      <w:lvlJc w:val="left"/>
+      <w:pPr>
+        <w:ind w:left="500" w:hanging="320"/>
+      </w:pPr>
+    </w:lvl>
+  </w:abstractNum>
   <w:num w:numId="1">
     <w:abstractNumId w:val="1"/>
     <w:lvlOverride w:ilvl="0">
@@ -32354,6 +33612,12 @@
   </w:num>
   <w:num w:numId="3">
     <w:abstractNumId w:val="3"/>
+    <w:lvlOverride w:ilvl="0">
+      <w:startOverride w:val="1"/>
+    </w:lvlOverride>
+  </w:num>
+  <w:num w:numId="4">
+    <w:abstractNumId w:val="4"/>
     <w:lvlOverride w:ilvl="0">
       <w:startOverride w:val="1"/>
     </w:lvlOverride>

</xml_diff>